<commit_message>
fixed auto t9 teacher name brocked
</commit_message>
<xml_diff>
--- a/Lab6/Игнатьев Д С Истмд11  Лаб6 Отчет.docx
+++ b/Lab6/Игнатьев Д С Истмд11  Лаб6 Отчет.docx
@@ -142,8 +142,13 @@
       <w:pPr>
         <w:jc w:val="right"/>
       </w:pPr>
-      <w:r>
-        <w:t>к.т.н, доцент кафедры «ИВК»</w:t>
+      <w:proofErr w:type="spellStart"/>
+      <w:r>
+        <w:t>к.т.н</w:t>
+      </w:r>
+      <w:proofErr w:type="spellEnd"/>
+      <w:r>
+        <w:t>, доцент кафедры «ИВК»</w:t>
       </w:r>
     </w:p>
     <w:p>
@@ -151,14 +156,21 @@
         <w:jc w:val="right"/>
       </w:pPr>
       <w:r>
-        <w:t>Шишкин Виктор Викторович</w:t>
-      </w:r>
+        <w:t xml:space="preserve">Шишкин </w:t>
+      </w:r>
+      <w:proofErr w:type="gramStart"/>
+      <w:r>
+        <w:t>В</w:t>
+      </w:r>
+      <w:r>
+        <w:t>.В</w:t>
+      </w:r>
+      <w:proofErr w:type="gramEnd"/>
     </w:p>
     <w:p/>
     <w:p/>
     <w:p/>
     <w:p/>
-    <w:p/>
     <w:p>
       <w:pPr>
         <w:jc w:val="center"/>
@@ -218,7 +230,25 @@
           <w:sz w:val="27"/>
           <w:szCs w:val="27"/>
         </w:rPr>
-        <w:t>Современные большие языковые модели (LLM) способны генерировать программный код по текстовому описанию задачи, что открывает новые возможности для автоматизации разработки программного обеспечения. Однако качество создаваемых ими решений остаётся непредсказуемым: сгенерированный код может быть корректным и эффективно решать поставленную задачу, но нередко содержит ошибки, неоптимальные конструкции, уязвимости или не соответствует лучшим практикам разработки. Отсутствие устойчивых критериев и общепринятых методик оценки качества автоматически генерируемого кода создаёт неопределённость при его использовании в реальных проектах и усложняет интеграцию LLM в профессиональные процессы разработки. Более того, сгенерированный код часто опирается на вероятностные шаблоны и универсальные конструкции, а не на строгое формальное выполнение условий задачи. Для разработчика программного обеспечения важно понимать, в каких случаях использование LLM для генерации кода оправдано, а в каких случаях собственное решение будет более эффективным с точки зрения производительности, надёжности и поддерживаемости. Также важно понимать, какие архитектурные и стилистические различия существуют между кодом, написанным человеком, и кодом, сгенерированным искусственным интеллектом. В контексте задачи обработки списков студентов-участников олимпиад возникает вопрос: какой подход — ручное написание кода на компилируемом языке (Go) или генерация решения с помощью LLM на интерпретируемом языке (Python) — обеспечит оптимальное соотношение между скоростью разработки, производительностью выполнения и качеством кода?</w:t>
+        <w:t xml:space="preserve">Современные большие языковые модели (LLM) способны генерировать программный код по текстовому описанию задачи, что открывает новые возможности для автоматизации разработки программного обеспечения. Однако качество создаваемых ими решений остаётся непредсказуемым: сгенерированный код может быть корректным и эффективно решать поставленную задачу, но нередко содержит ошибки, неоптимальные конструкции, уязвимости или не соответствует лучшим практикам разработки. Отсутствие устойчивых критериев и общепринятых методик оценки качества автоматически генерируемого кода создаёт неопределённость при его использовании в реальных проектах и усложняет интеграцию LLM в профессиональные процессы разработки. Более того, сгенерированный код часто опирается на вероятностные шаблоны и универсальные конструкции, а не на строгое формальное выполнение условий задачи. Для разработчика программного обеспечения важно понимать, в каких случаях использование LLM для генерации кода оправдано, а в каких случаях собственное решение будет более эффективным с точки зрения производительности, надёжности и </w:t>
+      </w:r>
+      <w:proofErr w:type="spellStart"/>
+      <w:r>
+        <w:rPr>
+          <w:rFonts w:ascii="Times New Roman" w:hAnsi="Times New Roman" w:cs="Times New Roman"/>
+          <w:sz w:val="27"/>
+          <w:szCs w:val="27"/>
+        </w:rPr>
+        <w:t>поддерживаемости</w:t>
+      </w:r>
+      <w:proofErr w:type="spellEnd"/>
+      <w:r>
+        <w:rPr>
+          <w:rFonts w:ascii="Times New Roman" w:hAnsi="Times New Roman" w:cs="Times New Roman"/>
+          <w:sz w:val="27"/>
+          <w:szCs w:val="27"/>
+        </w:rPr>
+        <w:t>. Также важно понимать, какие архитектурные и стилистические различия существуют между кодом, написанным человеком, и кодом, сгенерированным искусственным интеллектом. В контексте задачи обработки списков студентов-участников олимпиад возникает вопрос: какой подход — ручное написание кода на компилируемом языке (Go) или генерация решения с помощью LLM на интерпретируемом языке (Python) — обеспечит оптимальное соотношение между скоростью разработки, производительностью выполнения и качеством кода?</w:t>
       </w:r>
     </w:p>
     <w:p>
@@ -389,7 +419,25 @@
           <w:sz w:val="27"/>
           <w:szCs w:val="27"/>
         </w:rPr>
-        <w:t>лишних операций, тогда как LLM генерируют код, основанный на шаблонах и  «безопасных» универсальных конструкциях</w:t>
+        <w:t xml:space="preserve">лишних операций, тогда как LLM генерируют код, основанный на шаблонах </w:t>
+      </w:r>
+      <w:proofErr w:type="gramStart"/>
+      <w:r>
+        <w:rPr>
+          <w:rFonts w:ascii="Times New Roman" w:hAnsi="Times New Roman" w:cs="Times New Roman"/>
+          <w:sz w:val="27"/>
+          <w:szCs w:val="27"/>
+        </w:rPr>
+        <w:t>и  «</w:t>
+      </w:r>
+      <w:proofErr w:type="gramEnd"/>
+      <w:r>
+        <w:rPr>
+          <w:rFonts w:ascii="Times New Roman" w:hAnsi="Times New Roman" w:cs="Times New Roman"/>
+          <w:sz w:val="27"/>
+          <w:szCs w:val="27"/>
+        </w:rPr>
+        <w:t>безопасных» универсальных конструкциях</w:t>
       </w:r>
     </w:p>
     <w:p>
@@ -516,8 +564,36 @@
           <w:sz w:val="27"/>
           <w:szCs w:val="27"/>
         </w:rPr>
-        <w:t xml:space="preserve">   - Разработчик по привычке будет вносить практики продового кода в свой проект</w:t>
-      </w:r>
+        <w:t xml:space="preserve">   - Разработчик по привычке будет вносить практики </w:t>
+      </w:r>
+      <w:proofErr w:type="spellStart"/>
+      <w:r>
+        <w:rPr>
+          <w:rFonts w:ascii="Times New Roman" w:hAnsi="Times New Roman" w:cs="Times New Roman"/>
+          <w:sz w:val="27"/>
+          <w:szCs w:val="27"/>
+        </w:rPr>
+        <w:t>продового</w:t>
+      </w:r>
+      <w:proofErr w:type="spellEnd"/>
+      <w:r>
+        <w:rPr>
+          <w:rFonts w:ascii="Times New Roman" w:hAnsi="Times New Roman" w:cs="Times New Roman"/>
+          <w:sz w:val="27"/>
+          <w:szCs w:val="27"/>
+        </w:rPr>
+        <w:t xml:space="preserve"> кода в свой </w:t>
+      </w:r>
+      <w:proofErr w:type="gramStart"/>
+      <w:r>
+        <w:rPr>
+          <w:rFonts w:ascii="Times New Roman" w:hAnsi="Times New Roman" w:cs="Times New Roman"/>
+          <w:sz w:val="27"/>
+          <w:szCs w:val="27"/>
+        </w:rPr>
+        <w:t>проект</w:t>
+      </w:r>
+      <w:proofErr w:type="gramEnd"/>
       <w:r>
         <w:rPr>
           <w:rFonts w:ascii="Times New Roman" w:hAnsi="Times New Roman" w:cs="Times New Roman"/>
@@ -1000,8 +1076,18 @@
           <w:sz w:val="27"/>
           <w:szCs w:val="27"/>
         </w:rPr>
-        <w:t xml:space="preserve">   - Читаемость и поддерживаемость</w:t>
-      </w:r>
+        <w:t xml:space="preserve">   - Читаемость и </w:t>
+      </w:r>
+      <w:proofErr w:type="spellStart"/>
+      <w:r>
+        <w:rPr>
+          <w:rFonts w:ascii="Times New Roman" w:hAnsi="Times New Roman" w:cs="Times New Roman"/>
+          <w:sz w:val="27"/>
+          <w:szCs w:val="27"/>
+        </w:rPr>
+        <w:t>поддерживаемость</w:t>
+      </w:r>
+      <w:proofErr w:type="spellEnd"/>
     </w:p>
     <w:p>
       <w:pPr>
@@ -1369,6 +1455,7 @@
         </w:rPr>
         <w:t>.</w:t>
       </w:r>
+      <w:proofErr w:type="spellStart"/>
       <w:r>
         <w:rPr>
           <w:rFonts w:ascii="Times New Roman" w:hAnsi="Times New Roman" w:cs="Times New Roman"/>
@@ -1378,6 +1465,7 @@
         </w:rPr>
         <w:t>py</w:t>
       </w:r>
+      <w:proofErr w:type="spellEnd"/>
       <w:r>
         <w:rPr>
           <w:rFonts w:ascii="Times New Roman" w:hAnsi="Times New Roman" w:cs="Times New Roman"/>
@@ -1405,6 +1493,7 @@
         </w:rPr>
         <w:t xml:space="preserve">который создаёт файлы </w:t>
       </w:r>
+      <w:proofErr w:type="spellStart"/>
       <w:r>
         <w:rPr>
           <w:rFonts w:ascii="Times New Roman" w:hAnsi="Times New Roman" w:cs="Times New Roman"/>
@@ -1414,6 +1503,7 @@
         </w:rPr>
         <w:t>olymp</w:t>
       </w:r>
+      <w:proofErr w:type="spellEnd"/>
       <w:r>
         <w:rPr>
           <w:rFonts w:ascii="Times New Roman" w:hAnsi="Times New Roman" w:cs="Times New Roman"/>
@@ -1439,6 +1529,7 @@
         </w:rPr>
         <w:t xml:space="preserve"> и </w:t>
       </w:r>
+      <w:proofErr w:type="spellStart"/>
       <w:r>
         <w:rPr>
           <w:rFonts w:ascii="Times New Roman" w:hAnsi="Times New Roman" w:cs="Times New Roman"/>
@@ -1448,6 +1539,7 @@
         </w:rPr>
         <w:t>olymp</w:t>
       </w:r>
+      <w:proofErr w:type="spellEnd"/>
       <w:r>
         <w:rPr>
           <w:rFonts w:ascii="Times New Roman" w:hAnsi="Times New Roman" w:cs="Times New Roman"/>
@@ -1745,7 +1837,25 @@
           <w:sz w:val="27"/>
           <w:szCs w:val="27"/>
         </w:rPr>
-        <w:t>4. Поддерживаемость: насколько легко вносить изменения</w:t>
+        <w:t xml:space="preserve">4. </w:t>
+      </w:r>
+      <w:proofErr w:type="spellStart"/>
+      <w:r>
+        <w:rPr>
+          <w:rFonts w:ascii="Times New Roman" w:hAnsi="Times New Roman" w:cs="Times New Roman"/>
+          <w:sz w:val="27"/>
+          <w:szCs w:val="27"/>
+        </w:rPr>
+        <w:t>Поддерживаемость</w:t>
+      </w:r>
+      <w:proofErr w:type="spellEnd"/>
+      <w:r>
+        <w:rPr>
+          <w:rFonts w:ascii="Times New Roman" w:hAnsi="Times New Roman" w:cs="Times New Roman"/>
+          <w:sz w:val="27"/>
+          <w:szCs w:val="27"/>
+        </w:rPr>
+        <w:t>: насколько легко вносить изменения</w:t>
       </w:r>
     </w:p>
     <w:p>
@@ -1822,7 +1932,133 @@
           <w:sz w:val="27"/>
           <w:szCs w:val="27"/>
         </w:rPr>
-        <w:t>Код написан в императивном стиле: "сделай то, потом это". Используются простыеструктуры данных (map[string]bool для хранения студентов и их призов, слайсдля сортировки). Все проверки условий (if/else) расписаны подробно.</w:t>
+        <w:t xml:space="preserve">Код написан в императивном стиле: "сделай то, потом это". Используются </w:t>
+      </w:r>
+      <w:proofErr w:type="spellStart"/>
+      <w:r>
+        <w:rPr>
+          <w:rFonts w:ascii="Times New Roman" w:hAnsi="Times New Roman" w:cs="Times New Roman"/>
+          <w:sz w:val="27"/>
+          <w:szCs w:val="27"/>
+        </w:rPr>
+        <w:t>простыеструктуры</w:t>
+      </w:r>
+      <w:proofErr w:type="spellEnd"/>
+      <w:r>
+        <w:rPr>
+          <w:rFonts w:ascii="Times New Roman" w:hAnsi="Times New Roman" w:cs="Times New Roman"/>
+          <w:sz w:val="27"/>
+          <w:szCs w:val="27"/>
+        </w:rPr>
+        <w:t xml:space="preserve"> данных (</w:t>
+      </w:r>
+      <w:proofErr w:type="spellStart"/>
+      <w:r>
+        <w:rPr>
+          <w:rFonts w:ascii="Times New Roman" w:hAnsi="Times New Roman" w:cs="Times New Roman"/>
+          <w:sz w:val="27"/>
+          <w:szCs w:val="27"/>
+        </w:rPr>
+        <w:t>map</w:t>
+      </w:r>
+      <w:proofErr w:type="spellEnd"/>
+      <w:r>
+        <w:rPr>
+          <w:rFonts w:ascii="Times New Roman" w:hAnsi="Times New Roman" w:cs="Times New Roman"/>
+          <w:sz w:val="27"/>
+          <w:szCs w:val="27"/>
+        </w:rPr>
+        <w:t>[</w:t>
+      </w:r>
+      <w:proofErr w:type="spellStart"/>
+      <w:r>
+        <w:rPr>
+          <w:rFonts w:ascii="Times New Roman" w:hAnsi="Times New Roman" w:cs="Times New Roman"/>
+          <w:sz w:val="27"/>
+          <w:szCs w:val="27"/>
+        </w:rPr>
+        <w:t>string</w:t>
+      </w:r>
+      <w:proofErr w:type="spellEnd"/>
+      <w:r>
+        <w:rPr>
+          <w:rFonts w:ascii="Times New Roman" w:hAnsi="Times New Roman" w:cs="Times New Roman"/>
+          <w:sz w:val="27"/>
+          <w:szCs w:val="27"/>
+        </w:rPr>
+        <w:t>]</w:t>
+      </w:r>
+      <w:proofErr w:type="spellStart"/>
+      <w:r>
+        <w:rPr>
+          <w:rFonts w:ascii="Times New Roman" w:hAnsi="Times New Roman" w:cs="Times New Roman"/>
+          <w:sz w:val="27"/>
+          <w:szCs w:val="27"/>
+        </w:rPr>
+        <w:t>bool</w:t>
+      </w:r>
+      <w:proofErr w:type="spellEnd"/>
+      <w:r>
+        <w:rPr>
+          <w:rFonts w:ascii="Times New Roman" w:hAnsi="Times New Roman" w:cs="Times New Roman"/>
+          <w:sz w:val="27"/>
+          <w:szCs w:val="27"/>
+        </w:rPr>
+        <w:t xml:space="preserve"> для хранения студентов и их призов, </w:t>
+      </w:r>
+      <w:proofErr w:type="spellStart"/>
+      <w:r>
+        <w:rPr>
+          <w:rFonts w:ascii="Times New Roman" w:hAnsi="Times New Roman" w:cs="Times New Roman"/>
+          <w:sz w:val="27"/>
+          <w:szCs w:val="27"/>
+        </w:rPr>
+        <w:t>слайсдля</w:t>
+      </w:r>
+      <w:proofErr w:type="spellEnd"/>
+      <w:r>
+        <w:rPr>
+          <w:rFonts w:ascii="Times New Roman" w:hAnsi="Times New Roman" w:cs="Times New Roman"/>
+          <w:sz w:val="27"/>
+          <w:szCs w:val="27"/>
+        </w:rPr>
+        <w:t xml:space="preserve"> сортировки). Все проверки условий (</w:t>
+      </w:r>
+      <w:proofErr w:type="spellStart"/>
+      <w:r>
+        <w:rPr>
+          <w:rFonts w:ascii="Times New Roman" w:hAnsi="Times New Roman" w:cs="Times New Roman"/>
+          <w:sz w:val="27"/>
+          <w:szCs w:val="27"/>
+        </w:rPr>
+        <w:t>if</w:t>
+      </w:r>
+      <w:proofErr w:type="spellEnd"/>
+      <w:r>
+        <w:rPr>
+          <w:rFonts w:ascii="Times New Roman" w:hAnsi="Times New Roman" w:cs="Times New Roman"/>
+          <w:sz w:val="27"/>
+          <w:szCs w:val="27"/>
+        </w:rPr>
+        <w:t>/</w:t>
+      </w:r>
+      <w:proofErr w:type="spellStart"/>
+      <w:r>
+        <w:rPr>
+          <w:rFonts w:ascii="Times New Roman" w:hAnsi="Times New Roman" w:cs="Times New Roman"/>
+          <w:sz w:val="27"/>
+          <w:szCs w:val="27"/>
+        </w:rPr>
+        <w:t>else</w:t>
+      </w:r>
+      <w:proofErr w:type="spellEnd"/>
+      <w:r>
+        <w:rPr>
+          <w:rFonts w:ascii="Times New Roman" w:hAnsi="Times New Roman" w:cs="Times New Roman"/>
+          <w:sz w:val="27"/>
+          <w:szCs w:val="27"/>
+        </w:rPr>
+        <w:t>) расписаны подробно.</w:t>
       </w:r>
     </w:p>
     <w:p>
@@ -1896,41 +2132,89 @@
           <w:rFonts w:ascii="Times New Roman" w:hAnsi="Times New Roman" w:cs="Times New Roman"/>
           <w:lang w:val="en-US"/>
         </w:rPr>
-        <w:t xml:space="preserve">    "bufio"</w:t>
-      </w:r>
-    </w:p>
-    <w:p>
-      <w:pPr>
-        <w:spacing w:line="360" w:lineRule="auto"/>
-        <w:jc w:val="both"/>
-        <w:rPr>
-          <w:rFonts w:ascii="Times New Roman" w:hAnsi="Times New Roman" w:cs="Times New Roman"/>
-          <w:lang w:val="en-US"/>
-        </w:rPr>
-      </w:pPr>
-      <w:r>
-        <w:rPr>
-          <w:rFonts w:ascii="Times New Roman" w:hAnsi="Times New Roman" w:cs="Times New Roman"/>
-          <w:lang w:val="en-US"/>
-        </w:rPr>
-        <w:t xml:space="preserve">    "fmt"</w:t>
-      </w:r>
-    </w:p>
-    <w:p>
-      <w:pPr>
-        <w:spacing w:line="360" w:lineRule="auto"/>
-        <w:jc w:val="both"/>
-        <w:rPr>
-          <w:rFonts w:ascii="Times New Roman" w:hAnsi="Times New Roman" w:cs="Times New Roman"/>
-          <w:lang w:val="en-US"/>
-        </w:rPr>
-      </w:pPr>
-      <w:r>
-        <w:rPr>
-          <w:rFonts w:ascii="Times New Roman" w:hAnsi="Times New Roman" w:cs="Times New Roman"/>
-          <w:lang w:val="en-US"/>
-        </w:rPr>
-        <w:t xml:space="preserve">    "os"</w:t>
+        <w:t xml:space="preserve">    "</w:t>
+      </w:r>
+      <w:proofErr w:type="spellStart"/>
+      <w:r>
+        <w:rPr>
+          <w:rFonts w:ascii="Times New Roman" w:hAnsi="Times New Roman" w:cs="Times New Roman"/>
+          <w:lang w:val="en-US"/>
+        </w:rPr>
+        <w:t>bufio</w:t>
+      </w:r>
+      <w:proofErr w:type="spellEnd"/>
+      <w:r>
+        <w:rPr>
+          <w:rFonts w:ascii="Times New Roman" w:hAnsi="Times New Roman" w:cs="Times New Roman"/>
+          <w:lang w:val="en-US"/>
+        </w:rPr>
+        <w:t>"</w:t>
+      </w:r>
+    </w:p>
+    <w:p>
+      <w:pPr>
+        <w:spacing w:line="360" w:lineRule="auto"/>
+        <w:jc w:val="both"/>
+        <w:rPr>
+          <w:rFonts w:ascii="Times New Roman" w:hAnsi="Times New Roman" w:cs="Times New Roman"/>
+          <w:lang w:val="en-US"/>
+        </w:rPr>
+      </w:pPr>
+      <w:r>
+        <w:rPr>
+          <w:rFonts w:ascii="Times New Roman" w:hAnsi="Times New Roman" w:cs="Times New Roman"/>
+          <w:lang w:val="en-US"/>
+        </w:rPr>
+        <w:t xml:space="preserve">    "</w:t>
+      </w:r>
+      <w:proofErr w:type="spellStart"/>
+      <w:r>
+        <w:rPr>
+          <w:rFonts w:ascii="Times New Roman" w:hAnsi="Times New Roman" w:cs="Times New Roman"/>
+          <w:lang w:val="en-US"/>
+        </w:rPr>
+        <w:t>fmt</w:t>
+      </w:r>
+      <w:proofErr w:type="spellEnd"/>
+      <w:r>
+        <w:rPr>
+          <w:rFonts w:ascii="Times New Roman" w:hAnsi="Times New Roman" w:cs="Times New Roman"/>
+          <w:lang w:val="en-US"/>
+        </w:rPr>
+        <w:t>"</w:t>
+      </w:r>
+    </w:p>
+    <w:p>
+      <w:pPr>
+        <w:spacing w:line="360" w:lineRule="auto"/>
+        <w:jc w:val="both"/>
+        <w:rPr>
+          <w:rFonts w:ascii="Times New Roman" w:hAnsi="Times New Roman" w:cs="Times New Roman"/>
+          <w:lang w:val="en-US"/>
+        </w:rPr>
+      </w:pPr>
+      <w:r>
+        <w:rPr>
+          <w:rFonts w:ascii="Times New Roman" w:hAnsi="Times New Roman" w:cs="Times New Roman"/>
+          <w:lang w:val="en-US"/>
+        </w:rPr>
+        <w:t xml:space="preserve">    "</w:t>
+      </w:r>
+      <w:proofErr w:type="spellStart"/>
+      <w:r>
+        <w:rPr>
+          <w:rFonts w:ascii="Times New Roman" w:hAnsi="Times New Roman" w:cs="Times New Roman"/>
+          <w:lang w:val="en-US"/>
+        </w:rPr>
+        <w:t>os</w:t>
+      </w:r>
+      <w:proofErr w:type="spellEnd"/>
+      <w:r>
+        <w:rPr>
+          <w:rFonts w:ascii="Times New Roman" w:hAnsi="Times New Roman" w:cs="Times New Roman"/>
+          <w:lang w:val="en-US"/>
+        </w:rPr>
+        <w:t>"</w:t>
       </w:r>
     </w:p>
     <w:p>
@@ -2003,63 +2287,135 @@
           <w:lang w:val="en-US"/>
         </w:rPr>
       </w:pPr>
-      <w:r>
-        <w:rPr>
-          <w:rFonts w:ascii="Times New Roman" w:hAnsi="Times New Roman" w:cs="Times New Roman"/>
-          <w:lang w:val="en-US"/>
-        </w:rPr>
-        <w:t>func main() {</w:t>
-      </w:r>
-    </w:p>
-    <w:p>
-      <w:pPr>
-        <w:spacing w:line="360" w:lineRule="auto"/>
-        <w:jc w:val="both"/>
-        <w:rPr>
-          <w:rFonts w:ascii="Times New Roman" w:hAnsi="Times New Roman" w:cs="Times New Roman"/>
-          <w:lang w:val="en-US"/>
-        </w:rPr>
-      </w:pPr>
-      <w:r>
-        <w:rPr>
-          <w:rFonts w:ascii="Times New Roman" w:hAnsi="Times New Roman" w:cs="Times New Roman"/>
-          <w:lang w:val="en-US"/>
-        </w:rPr>
-        <w:t xml:space="preserve">    m1 := readFile("olymp1.txt")</w:t>
-      </w:r>
-    </w:p>
-    <w:p>
-      <w:pPr>
-        <w:spacing w:line="360" w:lineRule="auto"/>
-        <w:jc w:val="both"/>
-        <w:rPr>
-          <w:rFonts w:ascii="Times New Roman" w:hAnsi="Times New Roman" w:cs="Times New Roman"/>
-          <w:lang w:val="en-US"/>
-        </w:rPr>
-      </w:pPr>
-      <w:r>
-        <w:rPr>
-          <w:rFonts w:ascii="Times New Roman" w:hAnsi="Times New Roman" w:cs="Times New Roman"/>
-          <w:lang w:val="en-US"/>
-        </w:rPr>
-        <w:t xml:space="preserve">    m2 := readFile("olymp2.txt")</w:t>
-      </w:r>
-    </w:p>
-    <w:p>
-      <w:pPr>
-        <w:spacing w:line="360" w:lineRule="auto"/>
-        <w:jc w:val="both"/>
-        <w:rPr>
-          <w:rFonts w:ascii="Times New Roman" w:hAnsi="Times New Roman" w:cs="Times New Roman"/>
-          <w:lang w:val="en-US"/>
-        </w:rPr>
-      </w:pPr>
-      <w:r>
-        <w:rPr>
-          <w:rFonts w:ascii="Times New Roman" w:hAnsi="Times New Roman" w:cs="Times New Roman"/>
-          <w:lang w:val="en-US"/>
-        </w:rPr>
-        <w:t xml:space="preserve">    all := make(map[string]bool)</w:t>
+      <w:proofErr w:type="spellStart"/>
+      <w:r>
+        <w:rPr>
+          <w:rFonts w:ascii="Times New Roman" w:hAnsi="Times New Roman" w:cs="Times New Roman"/>
+          <w:lang w:val="en-US"/>
+        </w:rPr>
+        <w:t>func</w:t>
+      </w:r>
+      <w:proofErr w:type="spellEnd"/>
+      <w:r>
+        <w:rPr>
+          <w:rFonts w:ascii="Times New Roman" w:hAnsi="Times New Roman" w:cs="Times New Roman"/>
+          <w:lang w:val="en-US"/>
+        </w:rPr>
+        <w:t xml:space="preserve"> </w:t>
+      </w:r>
+      <w:proofErr w:type="gramStart"/>
+      <w:r>
+        <w:rPr>
+          <w:rFonts w:ascii="Times New Roman" w:hAnsi="Times New Roman" w:cs="Times New Roman"/>
+          <w:lang w:val="en-US"/>
+        </w:rPr>
+        <w:t>main(</w:t>
+      </w:r>
+      <w:proofErr w:type="gramEnd"/>
+      <w:r>
+        <w:rPr>
+          <w:rFonts w:ascii="Times New Roman" w:hAnsi="Times New Roman" w:cs="Times New Roman"/>
+          <w:lang w:val="en-US"/>
+        </w:rPr>
+        <w:t>) {</w:t>
+      </w:r>
+    </w:p>
+    <w:p>
+      <w:pPr>
+        <w:spacing w:line="360" w:lineRule="auto"/>
+        <w:jc w:val="both"/>
+        <w:rPr>
+          <w:rFonts w:ascii="Times New Roman" w:hAnsi="Times New Roman" w:cs="Times New Roman"/>
+          <w:lang w:val="en-US"/>
+        </w:rPr>
+      </w:pPr>
+      <w:r>
+        <w:rPr>
+          <w:rFonts w:ascii="Times New Roman" w:hAnsi="Times New Roman" w:cs="Times New Roman"/>
+          <w:lang w:val="en-US"/>
+        </w:rPr>
+        <w:t xml:space="preserve">    m</w:t>
+      </w:r>
+      <w:proofErr w:type="gramStart"/>
+      <w:r>
+        <w:rPr>
+          <w:rFonts w:ascii="Times New Roman" w:hAnsi="Times New Roman" w:cs="Times New Roman"/>
+          <w:lang w:val="en-US"/>
+        </w:rPr>
+        <w:t>1 :</w:t>
+      </w:r>
+      <w:proofErr w:type="gramEnd"/>
+      <w:r>
+        <w:rPr>
+          <w:rFonts w:ascii="Times New Roman" w:hAnsi="Times New Roman" w:cs="Times New Roman"/>
+          <w:lang w:val="en-US"/>
+        </w:rPr>
+        <w:t xml:space="preserve">= </w:t>
+      </w:r>
+      <w:proofErr w:type="spellStart"/>
+      <w:r>
+        <w:rPr>
+          <w:rFonts w:ascii="Times New Roman" w:hAnsi="Times New Roman" w:cs="Times New Roman"/>
+          <w:lang w:val="en-US"/>
+        </w:rPr>
+        <w:t>readFile</w:t>
+      </w:r>
+      <w:proofErr w:type="spellEnd"/>
+      <w:r>
+        <w:rPr>
+          <w:rFonts w:ascii="Times New Roman" w:hAnsi="Times New Roman" w:cs="Times New Roman"/>
+          <w:lang w:val="en-US"/>
+        </w:rPr>
+        <w:t>("olymp1.txt")</w:t>
+      </w:r>
+    </w:p>
+    <w:p>
+      <w:pPr>
+        <w:spacing w:line="360" w:lineRule="auto"/>
+        <w:jc w:val="both"/>
+        <w:rPr>
+          <w:rFonts w:ascii="Times New Roman" w:hAnsi="Times New Roman" w:cs="Times New Roman"/>
+          <w:lang w:val="en-US"/>
+        </w:rPr>
+      </w:pPr>
+      <w:r>
+        <w:rPr>
+          <w:rFonts w:ascii="Times New Roman" w:hAnsi="Times New Roman" w:cs="Times New Roman"/>
+          <w:lang w:val="en-US"/>
+        </w:rPr>
+        <w:t xml:space="preserve">    m</w:t>
+      </w:r>
+      <w:proofErr w:type="gramStart"/>
+      <w:r>
+        <w:rPr>
+          <w:rFonts w:ascii="Times New Roman" w:hAnsi="Times New Roman" w:cs="Times New Roman"/>
+          <w:lang w:val="en-US"/>
+        </w:rPr>
+        <w:t>2 :</w:t>
+      </w:r>
+      <w:proofErr w:type="gramEnd"/>
+      <w:r>
+        <w:rPr>
+          <w:rFonts w:ascii="Times New Roman" w:hAnsi="Times New Roman" w:cs="Times New Roman"/>
+          <w:lang w:val="en-US"/>
+        </w:rPr>
+        <w:t xml:space="preserve">= </w:t>
+      </w:r>
+      <w:proofErr w:type="spellStart"/>
+      <w:r>
+        <w:rPr>
+          <w:rFonts w:ascii="Times New Roman" w:hAnsi="Times New Roman" w:cs="Times New Roman"/>
+          <w:lang w:val="en-US"/>
+        </w:rPr>
+        <w:t>readFile</w:t>
+      </w:r>
+      <w:proofErr w:type="spellEnd"/>
+      <w:r>
+        <w:rPr>
+          <w:rFonts w:ascii="Times New Roman" w:hAnsi="Times New Roman" w:cs="Times New Roman"/>
+          <w:lang w:val="en-US"/>
+        </w:rPr>
+        <w:t>("olymp2.txt")</w:t>
       </w:r>
     </w:p>
     <w:p>
@@ -2078,80 +2434,279 @@
         </w:rPr>
         <w:t xml:space="preserve">    </w:t>
       </w:r>
-      <w:r>
-        <w:rPr>
-          <w:rFonts w:ascii="Times New Roman" w:hAnsi="Times New Roman" w:cs="Times New Roman"/>
-          <w:lang w:val="en-US"/>
-        </w:rPr>
-        <w:t>for k := range m1 { all[k] = true }</w:t>
-      </w:r>
-    </w:p>
-    <w:p>
-      <w:pPr>
-        <w:spacing w:line="360" w:lineRule="auto"/>
-        <w:jc w:val="both"/>
-        <w:rPr>
-          <w:rFonts w:ascii="Times New Roman" w:hAnsi="Times New Roman" w:cs="Times New Roman"/>
-          <w:lang w:val="en-US"/>
-        </w:rPr>
-      </w:pPr>
-      <w:r>
-        <w:rPr>
-          <w:rFonts w:ascii="Times New Roman" w:hAnsi="Times New Roman" w:cs="Times New Roman"/>
-          <w:lang w:val="en-US"/>
-        </w:rPr>
-        <w:t xml:space="preserve">    for k := range m2 { all[k] = true }</w:t>
-      </w:r>
-    </w:p>
-    <w:p>
-      <w:pPr>
-        <w:spacing w:line="360" w:lineRule="auto"/>
-        <w:jc w:val="both"/>
-        <w:rPr>
-          <w:rFonts w:ascii="Times New Roman" w:hAnsi="Times New Roman" w:cs="Times New Roman"/>
-          <w:lang w:val="en-US"/>
-        </w:rPr>
-      </w:pPr>
-      <w:r>
-        <w:rPr>
-          <w:rFonts w:ascii="Times New Roman" w:hAnsi="Times New Roman" w:cs="Times New Roman"/>
-          <w:lang w:val="en-US"/>
-        </w:rPr>
-        <w:t xml:space="preserve">    var names []string</w:t>
-      </w:r>
-    </w:p>
-    <w:p>
-      <w:pPr>
-        <w:spacing w:line="360" w:lineRule="auto"/>
-        <w:jc w:val="both"/>
-        <w:rPr>
-          <w:rFonts w:ascii="Times New Roman" w:hAnsi="Times New Roman" w:cs="Times New Roman"/>
-          <w:lang w:val="en-US"/>
-        </w:rPr>
-      </w:pPr>
-      <w:r>
-        <w:rPr>
-          <w:rFonts w:ascii="Times New Roman" w:hAnsi="Times New Roman" w:cs="Times New Roman"/>
-          <w:lang w:val="en-US"/>
-        </w:rPr>
-        <w:t xml:space="preserve">    for k := range all { names = append(names, k) }</w:t>
-      </w:r>
-    </w:p>
-    <w:p>
-      <w:pPr>
-        <w:spacing w:line="360" w:lineRule="auto"/>
-        <w:jc w:val="both"/>
-        <w:rPr>
-          <w:rFonts w:ascii="Times New Roman" w:hAnsi="Times New Roman" w:cs="Times New Roman"/>
-          <w:lang w:val="en-US"/>
-        </w:rPr>
-      </w:pPr>
-      <w:r>
-        <w:rPr>
-          <w:rFonts w:ascii="Times New Roman" w:hAnsi="Times New Roman" w:cs="Times New Roman"/>
-          <w:lang w:val="en-US"/>
-        </w:rPr>
-        <w:t xml:space="preserve">    sort.Strings(names)</w:t>
+      <w:proofErr w:type="gramStart"/>
+      <w:r>
+        <w:rPr>
+          <w:rFonts w:ascii="Times New Roman" w:hAnsi="Times New Roman" w:cs="Times New Roman"/>
+          <w:lang w:val="en-US"/>
+        </w:rPr>
+        <w:t>all :</w:t>
+      </w:r>
+      <w:proofErr w:type="gramEnd"/>
+      <w:r>
+        <w:rPr>
+          <w:rFonts w:ascii="Times New Roman" w:hAnsi="Times New Roman" w:cs="Times New Roman"/>
+          <w:lang w:val="en-US"/>
+        </w:rPr>
+        <w:t>= make(map[string]bool)</w:t>
+      </w:r>
+    </w:p>
+    <w:p>
+      <w:pPr>
+        <w:spacing w:line="360" w:lineRule="auto"/>
+        <w:jc w:val="both"/>
+        <w:rPr>
+          <w:rFonts w:ascii="Times New Roman" w:hAnsi="Times New Roman" w:cs="Times New Roman"/>
+          <w:lang w:val="en-US"/>
+        </w:rPr>
+      </w:pPr>
+      <w:r>
+        <w:rPr>
+          <w:rFonts w:ascii="Times New Roman" w:hAnsi="Times New Roman" w:cs="Times New Roman"/>
+          <w:lang w:val="en-US"/>
+        </w:rPr>
+        <w:t xml:space="preserve">    </w:t>
+      </w:r>
+      <w:r>
+        <w:rPr>
+          <w:rFonts w:ascii="Times New Roman" w:hAnsi="Times New Roman" w:cs="Times New Roman"/>
+          <w:lang w:val="en-US"/>
+        </w:rPr>
+        <w:t xml:space="preserve">for </w:t>
+      </w:r>
+      <w:proofErr w:type="gramStart"/>
+      <w:r>
+        <w:rPr>
+          <w:rFonts w:ascii="Times New Roman" w:hAnsi="Times New Roman" w:cs="Times New Roman"/>
+          <w:lang w:val="en-US"/>
+        </w:rPr>
+        <w:t>k :</w:t>
+      </w:r>
+      <w:proofErr w:type="gramEnd"/>
+      <w:r>
+        <w:rPr>
+          <w:rFonts w:ascii="Times New Roman" w:hAnsi="Times New Roman" w:cs="Times New Roman"/>
+          <w:lang w:val="en-US"/>
+        </w:rPr>
+        <w:t xml:space="preserve">= range m1 </w:t>
+      </w:r>
+      <w:proofErr w:type="gramStart"/>
+      <w:r>
+        <w:rPr>
+          <w:rFonts w:ascii="Times New Roman" w:hAnsi="Times New Roman" w:cs="Times New Roman"/>
+          <w:lang w:val="en-US"/>
+        </w:rPr>
+        <w:t>{ all</w:t>
+      </w:r>
+      <w:proofErr w:type="gramEnd"/>
+      <w:r>
+        <w:rPr>
+          <w:rFonts w:ascii="Times New Roman" w:hAnsi="Times New Roman" w:cs="Times New Roman"/>
+          <w:lang w:val="en-US"/>
+        </w:rPr>
+        <w:t xml:space="preserve">[k] = </w:t>
+      </w:r>
+      <w:proofErr w:type="gramStart"/>
+      <w:r>
+        <w:rPr>
+          <w:rFonts w:ascii="Times New Roman" w:hAnsi="Times New Roman" w:cs="Times New Roman"/>
+          <w:lang w:val="en-US"/>
+        </w:rPr>
+        <w:t>true }</w:t>
+      </w:r>
+      <w:proofErr w:type="gramEnd"/>
+    </w:p>
+    <w:p>
+      <w:pPr>
+        <w:spacing w:line="360" w:lineRule="auto"/>
+        <w:jc w:val="both"/>
+        <w:rPr>
+          <w:rFonts w:ascii="Times New Roman" w:hAnsi="Times New Roman" w:cs="Times New Roman"/>
+          <w:lang w:val="en-US"/>
+        </w:rPr>
+      </w:pPr>
+      <w:r>
+        <w:rPr>
+          <w:rFonts w:ascii="Times New Roman" w:hAnsi="Times New Roman" w:cs="Times New Roman"/>
+          <w:lang w:val="en-US"/>
+        </w:rPr>
+        <w:t xml:space="preserve">    for </w:t>
+      </w:r>
+      <w:proofErr w:type="gramStart"/>
+      <w:r>
+        <w:rPr>
+          <w:rFonts w:ascii="Times New Roman" w:hAnsi="Times New Roman" w:cs="Times New Roman"/>
+          <w:lang w:val="en-US"/>
+        </w:rPr>
+        <w:t>k :</w:t>
+      </w:r>
+      <w:proofErr w:type="gramEnd"/>
+      <w:r>
+        <w:rPr>
+          <w:rFonts w:ascii="Times New Roman" w:hAnsi="Times New Roman" w:cs="Times New Roman"/>
+          <w:lang w:val="en-US"/>
+        </w:rPr>
+        <w:t xml:space="preserve">= range m2 </w:t>
+      </w:r>
+      <w:proofErr w:type="gramStart"/>
+      <w:r>
+        <w:rPr>
+          <w:rFonts w:ascii="Times New Roman" w:hAnsi="Times New Roman" w:cs="Times New Roman"/>
+          <w:lang w:val="en-US"/>
+        </w:rPr>
+        <w:t>{ all</w:t>
+      </w:r>
+      <w:proofErr w:type="gramEnd"/>
+      <w:r>
+        <w:rPr>
+          <w:rFonts w:ascii="Times New Roman" w:hAnsi="Times New Roman" w:cs="Times New Roman"/>
+          <w:lang w:val="en-US"/>
+        </w:rPr>
+        <w:t xml:space="preserve">[k] = </w:t>
+      </w:r>
+      <w:proofErr w:type="gramStart"/>
+      <w:r>
+        <w:rPr>
+          <w:rFonts w:ascii="Times New Roman" w:hAnsi="Times New Roman" w:cs="Times New Roman"/>
+          <w:lang w:val="en-US"/>
+        </w:rPr>
+        <w:t>true }</w:t>
+      </w:r>
+      <w:proofErr w:type="gramEnd"/>
+    </w:p>
+    <w:p>
+      <w:pPr>
+        <w:spacing w:line="360" w:lineRule="auto"/>
+        <w:jc w:val="both"/>
+        <w:rPr>
+          <w:rFonts w:ascii="Times New Roman" w:hAnsi="Times New Roman" w:cs="Times New Roman"/>
+          <w:lang w:val="en-US"/>
+        </w:rPr>
+      </w:pPr>
+      <w:r>
+        <w:rPr>
+          <w:rFonts w:ascii="Times New Roman" w:hAnsi="Times New Roman" w:cs="Times New Roman"/>
+          <w:lang w:val="en-US"/>
+        </w:rPr>
+        <w:t xml:space="preserve">    var names </w:t>
+      </w:r>
+      <w:proofErr w:type="gramStart"/>
+      <w:r>
+        <w:rPr>
+          <w:rFonts w:ascii="Times New Roman" w:hAnsi="Times New Roman" w:cs="Times New Roman"/>
+          <w:lang w:val="en-US"/>
+        </w:rPr>
+        <w:t>[]string</w:t>
+      </w:r>
+      <w:proofErr w:type="gramEnd"/>
+    </w:p>
+    <w:p>
+      <w:pPr>
+        <w:spacing w:line="360" w:lineRule="auto"/>
+        <w:jc w:val="both"/>
+        <w:rPr>
+          <w:rFonts w:ascii="Times New Roman" w:hAnsi="Times New Roman" w:cs="Times New Roman"/>
+          <w:lang w:val="en-US"/>
+        </w:rPr>
+      </w:pPr>
+      <w:r>
+        <w:rPr>
+          <w:rFonts w:ascii="Times New Roman" w:hAnsi="Times New Roman" w:cs="Times New Roman"/>
+          <w:lang w:val="en-US"/>
+        </w:rPr>
+        <w:t xml:space="preserve">    for </w:t>
+      </w:r>
+      <w:proofErr w:type="gramStart"/>
+      <w:r>
+        <w:rPr>
+          <w:rFonts w:ascii="Times New Roman" w:hAnsi="Times New Roman" w:cs="Times New Roman"/>
+          <w:lang w:val="en-US"/>
+        </w:rPr>
+        <w:t>k :</w:t>
+      </w:r>
+      <w:proofErr w:type="gramEnd"/>
+      <w:r>
+        <w:rPr>
+          <w:rFonts w:ascii="Times New Roman" w:hAnsi="Times New Roman" w:cs="Times New Roman"/>
+          <w:lang w:val="en-US"/>
+        </w:rPr>
+        <w:t xml:space="preserve">= range all </w:t>
+      </w:r>
+      <w:proofErr w:type="gramStart"/>
+      <w:r>
+        <w:rPr>
+          <w:rFonts w:ascii="Times New Roman" w:hAnsi="Times New Roman" w:cs="Times New Roman"/>
+          <w:lang w:val="en-US"/>
+        </w:rPr>
+        <w:t>{ names</w:t>
+      </w:r>
+      <w:proofErr w:type="gramEnd"/>
+      <w:r>
+        <w:rPr>
+          <w:rFonts w:ascii="Times New Roman" w:hAnsi="Times New Roman" w:cs="Times New Roman"/>
+          <w:lang w:val="en-US"/>
+        </w:rPr>
+        <w:t xml:space="preserve"> = </w:t>
+      </w:r>
+      <w:proofErr w:type="gramStart"/>
+      <w:r>
+        <w:rPr>
+          <w:rFonts w:ascii="Times New Roman" w:hAnsi="Times New Roman" w:cs="Times New Roman"/>
+          <w:lang w:val="en-US"/>
+        </w:rPr>
+        <w:t>append(</w:t>
+      </w:r>
+      <w:proofErr w:type="gramEnd"/>
+      <w:r>
+        <w:rPr>
+          <w:rFonts w:ascii="Times New Roman" w:hAnsi="Times New Roman" w:cs="Times New Roman"/>
+          <w:lang w:val="en-US"/>
+        </w:rPr>
+        <w:t>names, k</w:t>
+      </w:r>
+      <w:proofErr w:type="gramStart"/>
+      <w:r>
+        <w:rPr>
+          <w:rFonts w:ascii="Times New Roman" w:hAnsi="Times New Roman" w:cs="Times New Roman"/>
+          <w:lang w:val="en-US"/>
+        </w:rPr>
+        <w:t>) }</w:t>
+      </w:r>
+      <w:proofErr w:type="gramEnd"/>
+    </w:p>
+    <w:p>
+      <w:pPr>
+        <w:spacing w:line="360" w:lineRule="auto"/>
+        <w:jc w:val="both"/>
+        <w:rPr>
+          <w:rFonts w:ascii="Times New Roman" w:hAnsi="Times New Roman" w:cs="Times New Roman"/>
+          <w:lang w:val="en-US"/>
+        </w:rPr>
+      </w:pPr>
+      <w:r>
+        <w:rPr>
+          <w:rFonts w:ascii="Times New Roman" w:hAnsi="Times New Roman" w:cs="Times New Roman"/>
+          <w:lang w:val="en-US"/>
+        </w:rPr>
+        <w:t xml:space="preserve">    </w:t>
+      </w:r>
+      <w:proofErr w:type="spellStart"/>
+      <w:proofErr w:type="gramStart"/>
+      <w:r>
+        <w:rPr>
+          <w:rFonts w:ascii="Times New Roman" w:hAnsi="Times New Roman" w:cs="Times New Roman"/>
+          <w:lang w:val="en-US"/>
+        </w:rPr>
+        <w:t>sort.Strings</w:t>
+      </w:r>
+      <w:proofErr w:type="spellEnd"/>
+      <w:proofErr w:type="gramEnd"/>
+      <w:r>
+        <w:rPr>
+          <w:rFonts w:ascii="Times New Roman" w:hAnsi="Times New Roman" w:cs="Times New Roman"/>
+          <w:lang w:val="en-US"/>
+        </w:rPr>
+        <w:t>(names)</w:t>
       </w:r>
     </w:p>
     <w:p>
@@ -2179,85 +2734,181 @@
           <w:lang w:val="en-US"/>
         </w:rPr>
         <w:lastRenderedPageBreak/>
-        <w:t xml:space="preserve">    for _, name := range names {</w:t>
-      </w:r>
-    </w:p>
-    <w:p>
-      <w:pPr>
-        <w:spacing w:line="360" w:lineRule="auto"/>
-        <w:jc w:val="both"/>
-        <w:rPr>
-          <w:rFonts w:ascii="Times New Roman" w:hAnsi="Times New Roman" w:cs="Times New Roman"/>
-          <w:lang w:val="en-US"/>
-        </w:rPr>
-      </w:pPr>
-      <w:r>
-        <w:rPr>
-          <w:rFonts w:ascii="Times New Roman" w:hAnsi="Times New Roman" w:cs="Times New Roman"/>
-          <w:lang w:val="en-US"/>
-        </w:rPr>
-        <w:t xml:space="preserve">        in1, ok1 := m1[name]</w:t>
-      </w:r>
-    </w:p>
-    <w:p>
-      <w:pPr>
-        <w:spacing w:line="360" w:lineRule="auto"/>
-        <w:jc w:val="both"/>
-        <w:rPr>
-          <w:rFonts w:ascii="Times New Roman" w:hAnsi="Times New Roman" w:cs="Times New Roman"/>
-          <w:lang w:val="en-US"/>
-        </w:rPr>
-      </w:pPr>
-      <w:r>
-        <w:rPr>
-          <w:rFonts w:ascii="Times New Roman" w:hAnsi="Times New Roman" w:cs="Times New Roman"/>
-          <w:lang w:val="en-US"/>
-        </w:rPr>
-        <w:t xml:space="preserve">        in2, ok2 := m2[name]</w:t>
-      </w:r>
-    </w:p>
-    <w:p>
-      <w:pPr>
-        <w:spacing w:line="360" w:lineRule="auto"/>
-        <w:jc w:val="both"/>
-        <w:rPr>
-          <w:rFonts w:ascii="Times New Roman" w:hAnsi="Times New Roman" w:cs="Times New Roman"/>
-          <w:lang w:val="en-US"/>
-        </w:rPr>
-      </w:pPr>
-    </w:p>
-    <w:p>
-      <w:pPr>
-        <w:spacing w:line="360" w:lineRule="auto"/>
-        <w:jc w:val="both"/>
-        <w:rPr>
-          <w:rFonts w:ascii="Times New Roman" w:hAnsi="Times New Roman" w:cs="Times New Roman"/>
-          <w:lang w:val="en-US"/>
-        </w:rPr>
-      </w:pPr>
-      <w:r>
-        <w:rPr>
-          <w:rFonts w:ascii="Times New Roman" w:hAnsi="Times New Roman" w:cs="Times New Roman"/>
-          <w:lang w:val="en-US"/>
-        </w:rPr>
-        <w:t xml:space="preserve">        res := ""</w:t>
-      </w:r>
-    </w:p>
-    <w:p>
-      <w:pPr>
-        <w:spacing w:line="360" w:lineRule="auto"/>
-        <w:jc w:val="both"/>
-        <w:rPr>
-          <w:rFonts w:ascii="Times New Roman" w:hAnsi="Times New Roman" w:cs="Times New Roman"/>
-          <w:lang w:val="en-US"/>
-        </w:rPr>
-      </w:pPr>
-      <w:r>
-        <w:rPr>
-          <w:rFonts w:ascii="Times New Roman" w:hAnsi="Times New Roman" w:cs="Times New Roman"/>
-          <w:lang w:val="en-US"/>
-        </w:rPr>
-        <w:t xml:space="preserve">        if (ok1 &amp;&amp; !ok2) || (ok2 &amp;&amp; !ok1) {</w:t>
+        <w:t xml:space="preserve">    for _, </w:t>
+      </w:r>
+      <w:proofErr w:type="gramStart"/>
+      <w:r>
+        <w:rPr>
+          <w:rFonts w:ascii="Times New Roman" w:hAnsi="Times New Roman" w:cs="Times New Roman"/>
+          <w:lang w:val="en-US"/>
+        </w:rPr>
+        <w:t>name :</w:t>
+      </w:r>
+      <w:proofErr w:type="gramEnd"/>
+      <w:r>
+        <w:rPr>
+          <w:rFonts w:ascii="Times New Roman" w:hAnsi="Times New Roman" w:cs="Times New Roman"/>
+          <w:lang w:val="en-US"/>
+        </w:rPr>
+        <w:t>= range names {</w:t>
+      </w:r>
+    </w:p>
+    <w:p>
+      <w:pPr>
+        <w:spacing w:line="360" w:lineRule="auto"/>
+        <w:jc w:val="both"/>
+        <w:rPr>
+          <w:rFonts w:ascii="Times New Roman" w:hAnsi="Times New Roman" w:cs="Times New Roman"/>
+          <w:lang w:val="en-US"/>
+        </w:rPr>
+      </w:pPr>
+      <w:r>
+        <w:rPr>
+          <w:rFonts w:ascii="Times New Roman" w:hAnsi="Times New Roman" w:cs="Times New Roman"/>
+          <w:lang w:val="en-US"/>
+        </w:rPr>
+        <w:t xml:space="preserve">        in1, ok</w:t>
+      </w:r>
+      <w:proofErr w:type="gramStart"/>
+      <w:r>
+        <w:rPr>
+          <w:rFonts w:ascii="Times New Roman" w:hAnsi="Times New Roman" w:cs="Times New Roman"/>
+          <w:lang w:val="en-US"/>
+        </w:rPr>
+        <w:t>1 :</w:t>
+      </w:r>
+      <w:proofErr w:type="gramEnd"/>
+      <w:r>
+        <w:rPr>
+          <w:rFonts w:ascii="Times New Roman" w:hAnsi="Times New Roman" w:cs="Times New Roman"/>
+          <w:lang w:val="en-US"/>
+        </w:rPr>
+        <w:t>= m1[name]</w:t>
+      </w:r>
+    </w:p>
+    <w:p>
+      <w:pPr>
+        <w:spacing w:line="360" w:lineRule="auto"/>
+        <w:jc w:val="both"/>
+        <w:rPr>
+          <w:rFonts w:ascii="Times New Roman" w:hAnsi="Times New Roman" w:cs="Times New Roman"/>
+          <w:lang w:val="en-US"/>
+        </w:rPr>
+      </w:pPr>
+      <w:r>
+        <w:rPr>
+          <w:rFonts w:ascii="Times New Roman" w:hAnsi="Times New Roman" w:cs="Times New Roman"/>
+          <w:lang w:val="en-US"/>
+        </w:rPr>
+        <w:t xml:space="preserve">        in2, ok</w:t>
+      </w:r>
+      <w:proofErr w:type="gramStart"/>
+      <w:r>
+        <w:rPr>
+          <w:rFonts w:ascii="Times New Roman" w:hAnsi="Times New Roman" w:cs="Times New Roman"/>
+          <w:lang w:val="en-US"/>
+        </w:rPr>
+        <w:t>2 :</w:t>
+      </w:r>
+      <w:proofErr w:type="gramEnd"/>
+      <w:r>
+        <w:rPr>
+          <w:rFonts w:ascii="Times New Roman" w:hAnsi="Times New Roman" w:cs="Times New Roman"/>
+          <w:lang w:val="en-US"/>
+        </w:rPr>
+        <w:t>= m2[name]</w:t>
+      </w:r>
+    </w:p>
+    <w:p>
+      <w:pPr>
+        <w:spacing w:line="360" w:lineRule="auto"/>
+        <w:jc w:val="both"/>
+        <w:rPr>
+          <w:rFonts w:ascii="Times New Roman" w:hAnsi="Times New Roman" w:cs="Times New Roman"/>
+          <w:lang w:val="en-US"/>
+        </w:rPr>
+      </w:pPr>
+    </w:p>
+    <w:p>
+      <w:pPr>
+        <w:spacing w:line="360" w:lineRule="auto"/>
+        <w:jc w:val="both"/>
+        <w:rPr>
+          <w:rFonts w:ascii="Times New Roman" w:hAnsi="Times New Roman" w:cs="Times New Roman"/>
+          <w:lang w:val="en-US"/>
+        </w:rPr>
+      </w:pPr>
+      <w:r>
+        <w:rPr>
+          <w:rFonts w:ascii="Times New Roman" w:hAnsi="Times New Roman" w:cs="Times New Roman"/>
+          <w:lang w:val="en-US"/>
+        </w:rPr>
+        <w:t xml:space="preserve">        </w:t>
+      </w:r>
+      <w:proofErr w:type="gramStart"/>
+      <w:r>
+        <w:rPr>
+          <w:rFonts w:ascii="Times New Roman" w:hAnsi="Times New Roman" w:cs="Times New Roman"/>
+          <w:lang w:val="en-US"/>
+        </w:rPr>
+        <w:t>res :</w:t>
+      </w:r>
+      <w:proofErr w:type="gramEnd"/>
+      <w:r>
+        <w:rPr>
+          <w:rFonts w:ascii="Times New Roman" w:hAnsi="Times New Roman" w:cs="Times New Roman"/>
+          <w:lang w:val="en-US"/>
+        </w:rPr>
+        <w:t>= ""</w:t>
+      </w:r>
+    </w:p>
+    <w:p>
+      <w:pPr>
+        <w:spacing w:line="360" w:lineRule="auto"/>
+        <w:jc w:val="both"/>
+        <w:rPr>
+          <w:rFonts w:ascii="Times New Roman" w:hAnsi="Times New Roman" w:cs="Times New Roman"/>
+          <w:lang w:val="en-US"/>
+        </w:rPr>
+      </w:pPr>
+      <w:r>
+        <w:rPr>
+          <w:rFonts w:ascii="Times New Roman" w:hAnsi="Times New Roman" w:cs="Times New Roman"/>
+          <w:lang w:val="en-US"/>
+        </w:rPr>
+        <w:t xml:space="preserve">        if (ok1 &amp;</w:t>
+      </w:r>
+      <w:proofErr w:type="gramStart"/>
+      <w:r>
+        <w:rPr>
+          <w:rFonts w:ascii="Times New Roman" w:hAnsi="Times New Roman" w:cs="Times New Roman"/>
+          <w:lang w:val="en-US"/>
+        </w:rPr>
+        <w:t>&amp; !ok</w:t>
+      </w:r>
+      <w:proofErr w:type="gramEnd"/>
+      <w:r>
+        <w:rPr>
+          <w:rFonts w:ascii="Times New Roman" w:hAnsi="Times New Roman" w:cs="Times New Roman"/>
+          <w:lang w:val="en-US"/>
+        </w:rPr>
+        <w:t>2) || (ok2 &amp;</w:t>
+      </w:r>
+      <w:proofErr w:type="gramStart"/>
+      <w:r>
+        <w:rPr>
+          <w:rFonts w:ascii="Times New Roman" w:hAnsi="Times New Roman" w:cs="Times New Roman"/>
+          <w:lang w:val="en-US"/>
+        </w:rPr>
+        <w:t>&amp; !ok</w:t>
+      </w:r>
+      <w:proofErr w:type="gramEnd"/>
+      <w:r>
+        <w:rPr>
+          <w:rFonts w:ascii="Times New Roman" w:hAnsi="Times New Roman" w:cs="Times New Roman"/>
+          <w:lang w:val="en-US"/>
+        </w:rPr>
+        <w:t>1) {</w:t>
       </w:r>
     </w:p>
     <w:p>
@@ -2321,42 +2972,108 @@
           <w:rFonts w:ascii="Times New Roman" w:hAnsi="Times New Roman" w:cs="Times New Roman"/>
           <w:lang w:val="en-US"/>
         </w:rPr>
-        <w:t xml:space="preserve">            score := 0</w:t>
-      </w:r>
-    </w:p>
-    <w:p>
-      <w:pPr>
-        <w:spacing w:line="360" w:lineRule="auto"/>
-        <w:jc w:val="both"/>
-        <w:rPr>
-          <w:rFonts w:ascii="Times New Roman" w:hAnsi="Times New Roman" w:cs="Times New Roman"/>
-          <w:lang w:val="en-US"/>
-        </w:rPr>
-      </w:pPr>
-      <w:r>
-        <w:rPr>
-          <w:rFonts w:ascii="Times New Roman" w:hAnsi="Times New Roman" w:cs="Times New Roman"/>
-          <w:lang w:val="en-US"/>
-        </w:rPr>
-        <w:t xml:space="preserve">            if in1 { score++ }</w:t>
-      </w:r>
-    </w:p>
-    <w:p>
-      <w:pPr>
-        <w:spacing w:line="360" w:lineRule="auto"/>
-        <w:jc w:val="both"/>
-        <w:rPr>
-          <w:rFonts w:ascii="Times New Roman" w:hAnsi="Times New Roman" w:cs="Times New Roman"/>
-          <w:lang w:val="en-US"/>
-        </w:rPr>
-      </w:pPr>
-      <w:r>
-        <w:rPr>
-          <w:rFonts w:ascii="Times New Roman" w:hAnsi="Times New Roman" w:cs="Times New Roman"/>
-          <w:lang w:val="en-US"/>
-        </w:rPr>
-        <w:t xml:space="preserve">            if in2 { score++ }</w:t>
-      </w:r>
+        <w:t xml:space="preserve">            </w:t>
+      </w:r>
+      <w:proofErr w:type="gramStart"/>
+      <w:r>
+        <w:rPr>
+          <w:rFonts w:ascii="Times New Roman" w:hAnsi="Times New Roman" w:cs="Times New Roman"/>
+          <w:lang w:val="en-US"/>
+        </w:rPr>
+        <w:t>score :</w:t>
+      </w:r>
+      <w:proofErr w:type="gramEnd"/>
+      <w:r>
+        <w:rPr>
+          <w:rFonts w:ascii="Times New Roman" w:hAnsi="Times New Roman" w:cs="Times New Roman"/>
+          <w:lang w:val="en-US"/>
+        </w:rPr>
+        <w:t>= 0</w:t>
+      </w:r>
+    </w:p>
+    <w:p>
+      <w:pPr>
+        <w:spacing w:line="360" w:lineRule="auto"/>
+        <w:jc w:val="both"/>
+        <w:rPr>
+          <w:rFonts w:ascii="Times New Roman" w:hAnsi="Times New Roman" w:cs="Times New Roman"/>
+          <w:lang w:val="en-US"/>
+        </w:rPr>
+      </w:pPr>
+      <w:r>
+        <w:rPr>
+          <w:rFonts w:ascii="Times New Roman" w:hAnsi="Times New Roman" w:cs="Times New Roman"/>
+          <w:lang w:val="en-US"/>
+        </w:rPr>
+        <w:t xml:space="preserve">            if in1 </w:t>
+      </w:r>
+      <w:proofErr w:type="gramStart"/>
+      <w:r>
+        <w:rPr>
+          <w:rFonts w:ascii="Times New Roman" w:hAnsi="Times New Roman" w:cs="Times New Roman"/>
+          <w:lang w:val="en-US"/>
+        </w:rPr>
+        <w:t>{ score</w:t>
+      </w:r>
+      <w:proofErr w:type="gramEnd"/>
+      <w:r>
+        <w:rPr>
+          <w:rFonts w:ascii="Times New Roman" w:hAnsi="Times New Roman" w:cs="Times New Roman"/>
+          <w:lang w:val="en-US"/>
+        </w:rPr>
+        <w:t>+</w:t>
+      </w:r>
+      <w:proofErr w:type="gramStart"/>
+      <w:r>
+        <w:rPr>
+          <w:rFonts w:ascii="Times New Roman" w:hAnsi="Times New Roman" w:cs="Times New Roman"/>
+          <w:lang w:val="en-US"/>
+        </w:rPr>
+        <w:t>+ }</w:t>
+      </w:r>
+      <w:proofErr w:type="gramEnd"/>
+    </w:p>
+    <w:p>
+      <w:pPr>
+        <w:spacing w:line="360" w:lineRule="auto"/>
+        <w:jc w:val="both"/>
+        <w:rPr>
+          <w:rFonts w:ascii="Times New Roman" w:hAnsi="Times New Roman" w:cs="Times New Roman"/>
+          <w:lang w:val="en-US"/>
+        </w:rPr>
+      </w:pPr>
+      <w:r>
+        <w:rPr>
+          <w:rFonts w:ascii="Times New Roman" w:hAnsi="Times New Roman" w:cs="Times New Roman"/>
+          <w:lang w:val="en-US"/>
+        </w:rPr>
+        <w:t xml:space="preserve">            if in2 </w:t>
+      </w:r>
+      <w:proofErr w:type="gramStart"/>
+      <w:r>
+        <w:rPr>
+          <w:rFonts w:ascii="Times New Roman" w:hAnsi="Times New Roman" w:cs="Times New Roman"/>
+          <w:lang w:val="en-US"/>
+        </w:rPr>
+        <w:t>{ score</w:t>
+      </w:r>
+      <w:proofErr w:type="gramEnd"/>
+      <w:r>
+        <w:rPr>
+          <w:rFonts w:ascii="Times New Roman" w:hAnsi="Times New Roman" w:cs="Times New Roman"/>
+          <w:lang w:val="en-US"/>
+        </w:rPr>
+        <w:t>+</w:t>
+      </w:r>
+      <w:proofErr w:type="gramStart"/>
+      <w:r>
+        <w:rPr>
+          <w:rFonts w:ascii="Times New Roman" w:hAnsi="Times New Roman" w:cs="Times New Roman"/>
+          <w:lang w:val="en-US"/>
+        </w:rPr>
+        <w:t>+ }</w:t>
+      </w:r>
+      <w:proofErr w:type="gramEnd"/>
     </w:p>
     <w:p>
       <w:pPr>
@@ -2508,7 +3225,25 @@
           <w:rFonts w:ascii="Times New Roman" w:hAnsi="Times New Roman" w:cs="Times New Roman"/>
           <w:lang w:val="en-US"/>
         </w:rPr>
-        <w:t xml:space="preserve">        fmt.Printf("%s %s\n", name, res)</w:t>
+        <w:t xml:space="preserve">        </w:t>
+      </w:r>
+      <w:proofErr w:type="spellStart"/>
+      <w:proofErr w:type="gramStart"/>
+      <w:r>
+        <w:rPr>
+          <w:rFonts w:ascii="Times New Roman" w:hAnsi="Times New Roman" w:cs="Times New Roman"/>
+          <w:lang w:val="en-US"/>
+        </w:rPr>
+        <w:t>fmt.Printf</w:t>
+      </w:r>
+      <w:proofErr w:type="spellEnd"/>
+      <w:proofErr w:type="gramEnd"/>
+      <w:r>
+        <w:rPr>
+          <w:rFonts w:ascii="Times New Roman" w:hAnsi="Times New Roman" w:cs="Times New Roman"/>
+          <w:lang w:val="en-US"/>
+        </w:rPr>
+        <w:t>("%s %s\n", name, res)</w:t>
       </w:r>
     </w:p>
     <w:p>
@@ -2564,29 +3299,79 @@
           <w:lang w:val="en-US"/>
         </w:rPr>
       </w:pPr>
-      <w:r>
-        <w:rPr>
-          <w:rFonts w:ascii="Times New Roman" w:hAnsi="Times New Roman" w:cs="Times New Roman"/>
-          <w:lang w:val="en-US"/>
-        </w:rPr>
-        <w:t>func readFile(name string) map[string]bool {</w:t>
-      </w:r>
-    </w:p>
-    <w:p>
-      <w:pPr>
-        <w:spacing w:line="360" w:lineRule="auto"/>
-        <w:jc w:val="both"/>
-        <w:rPr>
-          <w:rFonts w:ascii="Times New Roman" w:hAnsi="Times New Roman" w:cs="Times New Roman"/>
-          <w:lang w:val="en-US"/>
-        </w:rPr>
-      </w:pPr>
-      <w:r>
-        <w:rPr>
-          <w:rFonts w:ascii="Times New Roman" w:hAnsi="Times New Roman" w:cs="Times New Roman"/>
-          <w:lang w:val="en-US"/>
-        </w:rPr>
-        <w:t xml:space="preserve">    m := make(map[string]bool)</w:t>
+      <w:proofErr w:type="spellStart"/>
+      <w:r>
+        <w:rPr>
+          <w:rFonts w:ascii="Times New Roman" w:hAnsi="Times New Roman" w:cs="Times New Roman"/>
+          <w:lang w:val="en-US"/>
+        </w:rPr>
+        <w:t>func</w:t>
+      </w:r>
+      <w:proofErr w:type="spellEnd"/>
+      <w:r>
+        <w:rPr>
+          <w:rFonts w:ascii="Times New Roman" w:hAnsi="Times New Roman" w:cs="Times New Roman"/>
+          <w:lang w:val="en-US"/>
+        </w:rPr>
+        <w:t xml:space="preserve"> </w:t>
+      </w:r>
+      <w:proofErr w:type="spellStart"/>
+      <w:proofErr w:type="gramStart"/>
+      <w:r>
+        <w:rPr>
+          <w:rFonts w:ascii="Times New Roman" w:hAnsi="Times New Roman" w:cs="Times New Roman"/>
+          <w:lang w:val="en-US"/>
+        </w:rPr>
+        <w:t>readFile</w:t>
+      </w:r>
+      <w:proofErr w:type="spellEnd"/>
+      <w:r>
+        <w:rPr>
+          <w:rFonts w:ascii="Times New Roman" w:hAnsi="Times New Roman" w:cs="Times New Roman"/>
+          <w:lang w:val="en-US"/>
+        </w:rPr>
+        <w:t>(</w:t>
+      </w:r>
+      <w:proofErr w:type="gramEnd"/>
+      <w:r>
+        <w:rPr>
+          <w:rFonts w:ascii="Times New Roman" w:hAnsi="Times New Roman" w:cs="Times New Roman"/>
+          <w:lang w:val="en-US"/>
+        </w:rPr>
+        <w:t>name string) map[string]bool {</w:t>
+      </w:r>
+    </w:p>
+    <w:p>
+      <w:pPr>
+        <w:spacing w:line="360" w:lineRule="auto"/>
+        <w:jc w:val="both"/>
+        <w:rPr>
+          <w:rFonts w:ascii="Times New Roman" w:hAnsi="Times New Roman" w:cs="Times New Roman"/>
+          <w:lang w:val="en-US"/>
+        </w:rPr>
+      </w:pPr>
+      <w:r>
+        <w:rPr>
+          <w:rFonts w:ascii="Times New Roman" w:hAnsi="Times New Roman" w:cs="Times New Roman"/>
+          <w:lang w:val="en-US"/>
+        </w:rPr>
+        <w:t xml:space="preserve">    </w:t>
+      </w:r>
+      <w:proofErr w:type="gramStart"/>
+      <w:r>
+        <w:rPr>
+          <w:rFonts w:ascii="Times New Roman" w:hAnsi="Times New Roman" w:cs="Times New Roman"/>
+          <w:lang w:val="en-US"/>
+        </w:rPr>
+        <w:t>m :</w:t>
+      </w:r>
+      <w:proofErr w:type="gramEnd"/>
+      <w:r>
+        <w:rPr>
+          <w:rFonts w:ascii="Times New Roman" w:hAnsi="Times New Roman" w:cs="Times New Roman"/>
+          <w:lang w:val="en-US"/>
+        </w:rPr>
+        <w:t>= make(map[string]bool)</w:t>
       </w:r>
     </w:p>
     <w:p>
@@ -2604,180 +3389,473 @@
           <w:lang w:val="en-US"/>
         </w:rPr>
         <w:lastRenderedPageBreak/>
-        <w:t xml:space="preserve">    f, _ := os.Open(name)</w:t>
-      </w:r>
-    </w:p>
-    <w:p>
-      <w:pPr>
-        <w:spacing w:line="360" w:lineRule="auto"/>
-        <w:jc w:val="both"/>
-        <w:rPr>
-          <w:rFonts w:ascii="Times New Roman" w:hAnsi="Times New Roman" w:cs="Times New Roman"/>
-          <w:lang w:val="en-US"/>
-        </w:rPr>
-      </w:pPr>
-      <w:r>
-        <w:rPr>
-          <w:rFonts w:ascii="Times New Roman" w:hAnsi="Times New Roman" w:cs="Times New Roman"/>
-          <w:lang w:val="en-US"/>
-        </w:rPr>
-        <w:t xml:space="preserve">    defer f.Close()</w:t>
-      </w:r>
-    </w:p>
-    <w:p>
-      <w:pPr>
-        <w:spacing w:line="360" w:lineRule="auto"/>
-        <w:jc w:val="both"/>
-        <w:rPr>
-          <w:rFonts w:ascii="Times New Roman" w:hAnsi="Times New Roman" w:cs="Times New Roman"/>
-          <w:lang w:val="en-US"/>
-        </w:rPr>
-      </w:pPr>
-    </w:p>
-    <w:p>
-      <w:pPr>
-        <w:spacing w:line="360" w:lineRule="auto"/>
-        <w:jc w:val="both"/>
-        <w:rPr>
-          <w:rFonts w:ascii="Times New Roman" w:hAnsi="Times New Roman" w:cs="Times New Roman"/>
-          <w:lang w:val="en-US"/>
-        </w:rPr>
-      </w:pPr>
-      <w:r>
-        <w:rPr>
-          <w:rFonts w:ascii="Times New Roman" w:hAnsi="Times New Roman" w:cs="Times New Roman"/>
-          <w:lang w:val="en-US"/>
-        </w:rPr>
-        <w:t xml:space="preserve">    sc := bufio.NewScanner(f)</w:t>
-      </w:r>
-    </w:p>
-    <w:p>
-      <w:pPr>
-        <w:spacing w:line="360" w:lineRule="auto"/>
-        <w:jc w:val="both"/>
-        <w:rPr>
-          <w:rFonts w:ascii="Times New Roman" w:hAnsi="Times New Roman" w:cs="Times New Roman"/>
-          <w:lang w:val="en-US"/>
-        </w:rPr>
-      </w:pPr>
-      <w:r>
-        <w:rPr>
-          <w:rFonts w:ascii="Times New Roman" w:hAnsi="Times New Roman" w:cs="Times New Roman"/>
-          <w:lang w:val="en-US"/>
-        </w:rPr>
-        <w:t xml:space="preserve">    for sc.Scan() {</w:t>
-      </w:r>
-    </w:p>
-    <w:p>
-      <w:pPr>
-        <w:spacing w:line="360" w:lineRule="auto"/>
-        <w:jc w:val="both"/>
-        <w:rPr>
-          <w:rFonts w:ascii="Times New Roman" w:hAnsi="Times New Roman" w:cs="Times New Roman"/>
-          <w:lang w:val="en-US"/>
-        </w:rPr>
-      </w:pPr>
-      <w:r>
-        <w:rPr>
-          <w:rFonts w:ascii="Times New Roman" w:hAnsi="Times New Roman" w:cs="Times New Roman"/>
-          <w:lang w:val="en-US"/>
-        </w:rPr>
-        <w:t xml:space="preserve">        parts := strings.Fields(sc.Text())</w:t>
-      </w:r>
-    </w:p>
-    <w:p>
-      <w:pPr>
-        <w:spacing w:line="360" w:lineRule="auto"/>
-        <w:jc w:val="both"/>
-        <w:rPr>
-          <w:rFonts w:ascii="Times New Roman" w:hAnsi="Times New Roman" w:cs="Times New Roman"/>
-          <w:lang w:val="en-US"/>
-        </w:rPr>
-      </w:pPr>
-      <w:r>
-        <w:rPr>
-          <w:rFonts w:ascii="Times New Roman" w:hAnsi="Times New Roman" w:cs="Times New Roman"/>
-          <w:lang w:val="en-US"/>
-        </w:rPr>
-        <w:t xml:space="preserve">        if len(parts) == 0 { continue }</w:t>
-      </w:r>
-    </w:p>
-    <w:p>
-      <w:pPr>
-        <w:spacing w:line="360" w:lineRule="auto"/>
-        <w:jc w:val="both"/>
-        <w:rPr>
-          <w:rFonts w:ascii="Times New Roman" w:hAnsi="Times New Roman" w:cs="Times New Roman"/>
-          <w:lang w:val="en-US"/>
-        </w:rPr>
-      </w:pPr>
-    </w:p>
-    <w:p>
-      <w:pPr>
-        <w:spacing w:line="360" w:lineRule="auto"/>
-        <w:jc w:val="both"/>
-        <w:rPr>
-          <w:rFonts w:ascii="Times New Roman" w:hAnsi="Times New Roman" w:cs="Times New Roman"/>
-          <w:lang w:val="en-US"/>
-        </w:rPr>
-      </w:pPr>
-      <w:r>
-        <w:rPr>
-          <w:rFonts w:ascii="Times New Roman" w:hAnsi="Times New Roman" w:cs="Times New Roman"/>
-          <w:lang w:val="en-US"/>
-        </w:rPr>
-        <w:t xml:space="preserve">        fam := parts[0]</w:t>
-      </w:r>
-    </w:p>
-    <w:p>
-      <w:pPr>
-        <w:spacing w:line="360" w:lineRule="auto"/>
-        <w:jc w:val="both"/>
-        <w:rPr>
-          <w:rFonts w:ascii="Times New Roman" w:hAnsi="Times New Roman" w:cs="Times New Roman"/>
-          <w:lang w:val="en-US"/>
-        </w:rPr>
-      </w:pPr>
-      <w:r>
-        <w:rPr>
-          <w:rFonts w:ascii="Times New Roman" w:hAnsi="Times New Roman" w:cs="Times New Roman"/>
-          <w:lang w:val="en-US"/>
-        </w:rPr>
-        <w:t xml:space="preserve">        prize := false</w:t>
-      </w:r>
-    </w:p>
-    <w:p>
-      <w:pPr>
-        <w:spacing w:line="360" w:lineRule="auto"/>
-        <w:jc w:val="both"/>
-        <w:rPr>
-          <w:rFonts w:ascii="Times New Roman" w:hAnsi="Times New Roman" w:cs="Times New Roman"/>
-          <w:lang w:val="en-US"/>
-        </w:rPr>
-      </w:pPr>
-      <w:r>
-        <w:rPr>
-          <w:rFonts w:ascii="Times New Roman" w:hAnsi="Times New Roman" w:cs="Times New Roman"/>
-          <w:lang w:val="en-US"/>
-        </w:rPr>
-        <w:t xml:space="preserve">        if len(parts) &gt; 1 {</w:t>
-      </w:r>
-    </w:p>
-    <w:p>
-      <w:pPr>
-        <w:spacing w:line="360" w:lineRule="auto"/>
-        <w:jc w:val="both"/>
-        <w:rPr>
-          <w:rFonts w:ascii="Times New Roman" w:hAnsi="Times New Roman" w:cs="Times New Roman"/>
-          <w:lang w:val="en-US"/>
-        </w:rPr>
-      </w:pPr>
-      <w:r>
-        <w:rPr>
-          <w:rFonts w:ascii="Times New Roman" w:hAnsi="Times New Roman" w:cs="Times New Roman"/>
-          <w:lang w:val="en-US"/>
-        </w:rPr>
-        <w:t xml:space="preserve">            p := parts[1]</w:t>
+        <w:t xml:space="preserve">    f, </w:t>
+      </w:r>
+      <w:proofErr w:type="gramStart"/>
+      <w:r>
+        <w:rPr>
+          <w:rFonts w:ascii="Times New Roman" w:hAnsi="Times New Roman" w:cs="Times New Roman"/>
+          <w:lang w:val="en-US"/>
+        </w:rPr>
+        <w:t>_ :</w:t>
+      </w:r>
+      <w:proofErr w:type="gramEnd"/>
+      <w:r>
+        <w:rPr>
+          <w:rFonts w:ascii="Times New Roman" w:hAnsi="Times New Roman" w:cs="Times New Roman"/>
+          <w:lang w:val="en-US"/>
+        </w:rPr>
+        <w:t xml:space="preserve">= </w:t>
+      </w:r>
+      <w:proofErr w:type="spellStart"/>
+      <w:proofErr w:type="gramStart"/>
+      <w:r>
+        <w:rPr>
+          <w:rFonts w:ascii="Times New Roman" w:hAnsi="Times New Roman" w:cs="Times New Roman"/>
+          <w:lang w:val="en-US"/>
+        </w:rPr>
+        <w:t>os.Open</w:t>
+      </w:r>
+      <w:proofErr w:type="spellEnd"/>
+      <w:proofErr w:type="gramEnd"/>
+      <w:r>
+        <w:rPr>
+          <w:rFonts w:ascii="Times New Roman" w:hAnsi="Times New Roman" w:cs="Times New Roman"/>
+          <w:lang w:val="en-US"/>
+        </w:rPr>
+        <w:t>(name)</w:t>
+      </w:r>
+    </w:p>
+    <w:p>
+      <w:pPr>
+        <w:spacing w:line="360" w:lineRule="auto"/>
+        <w:jc w:val="both"/>
+        <w:rPr>
+          <w:rFonts w:ascii="Times New Roman" w:hAnsi="Times New Roman" w:cs="Times New Roman"/>
+          <w:lang w:val="en-US"/>
+        </w:rPr>
+      </w:pPr>
+      <w:r>
+        <w:rPr>
+          <w:rFonts w:ascii="Times New Roman" w:hAnsi="Times New Roman" w:cs="Times New Roman"/>
+          <w:lang w:val="en-US"/>
+        </w:rPr>
+        <w:t xml:space="preserve">    defer </w:t>
+      </w:r>
+      <w:proofErr w:type="spellStart"/>
+      <w:proofErr w:type="gramStart"/>
+      <w:r>
+        <w:rPr>
+          <w:rFonts w:ascii="Times New Roman" w:hAnsi="Times New Roman" w:cs="Times New Roman"/>
+          <w:lang w:val="en-US"/>
+        </w:rPr>
+        <w:t>f.Close</w:t>
+      </w:r>
+      <w:proofErr w:type="spellEnd"/>
+      <w:proofErr w:type="gramEnd"/>
+      <w:r>
+        <w:rPr>
+          <w:rFonts w:ascii="Times New Roman" w:hAnsi="Times New Roman" w:cs="Times New Roman"/>
+          <w:lang w:val="en-US"/>
+        </w:rPr>
+        <w:t>()</w:t>
+      </w:r>
+    </w:p>
+    <w:p>
+      <w:pPr>
+        <w:spacing w:line="360" w:lineRule="auto"/>
+        <w:jc w:val="both"/>
+        <w:rPr>
+          <w:rFonts w:ascii="Times New Roman" w:hAnsi="Times New Roman" w:cs="Times New Roman"/>
+          <w:lang w:val="en-US"/>
+        </w:rPr>
+      </w:pPr>
+    </w:p>
+    <w:p>
+      <w:pPr>
+        <w:spacing w:line="360" w:lineRule="auto"/>
+        <w:jc w:val="both"/>
+        <w:rPr>
+          <w:rFonts w:ascii="Times New Roman" w:hAnsi="Times New Roman" w:cs="Times New Roman"/>
+          <w:lang w:val="en-US"/>
+        </w:rPr>
+      </w:pPr>
+      <w:r>
+        <w:rPr>
+          <w:rFonts w:ascii="Times New Roman" w:hAnsi="Times New Roman" w:cs="Times New Roman"/>
+          <w:lang w:val="en-US"/>
+        </w:rPr>
+        <w:t xml:space="preserve">    </w:t>
+      </w:r>
+      <w:proofErr w:type="spellStart"/>
+      <w:proofErr w:type="gramStart"/>
+      <w:r>
+        <w:rPr>
+          <w:rFonts w:ascii="Times New Roman" w:hAnsi="Times New Roman" w:cs="Times New Roman"/>
+          <w:lang w:val="en-US"/>
+        </w:rPr>
+        <w:t>sc</w:t>
+      </w:r>
+      <w:proofErr w:type="spellEnd"/>
+      <w:r>
+        <w:rPr>
+          <w:rFonts w:ascii="Times New Roman" w:hAnsi="Times New Roman" w:cs="Times New Roman"/>
+          <w:lang w:val="en-US"/>
+        </w:rPr>
+        <w:t xml:space="preserve"> :</w:t>
+      </w:r>
+      <w:proofErr w:type="gramEnd"/>
+      <w:r>
+        <w:rPr>
+          <w:rFonts w:ascii="Times New Roman" w:hAnsi="Times New Roman" w:cs="Times New Roman"/>
+          <w:lang w:val="en-US"/>
+        </w:rPr>
+        <w:t xml:space="preserve">= </w:t>
+      </w:r>
+      <w:proofErr w:type="spellStart"/>
+      <w:proofErr w:type="gramStart"/>
+      <w:r>
+        <w:rPr>
+          <w:rFonts w:ascii="Times New Roman" w:hAnsi="Times New Roman" w:cs="Times New Roman"/>
+          <w:lang w:val="en-US"/>
+        </w:rPr>
+        <w:t>bufio.NewScanner</w:t>
+      </w:r>
+      <w:proofErr w:type="spellEnd"/>
+      <w:proofErr w:type="gramEnd"/>
+      <w:r>
+        <w:rPr>
+          <w:rFonts w:ascii="Times New Roman" w:hAnsi="Times New Roman" w:cs="Times New Roman"/>
+          <w:lang w:val="en-US"/>
+        </w:rPr>
+        <w:t>(f)</w:t>
+      </w:r>
+    </w:p>
+    <w:p>
+      <w:pPr>
+        <w:spacing w:line="360" w:lineRule="auto"/>
+        <w:jc w:val="both"/>
+        <w:rPr>
+          <w:rFonts w:ascii="Times New Roman" w:hAnsi="Times New Roman" w:cs="Times New Roman"/>
+          <w:lang w:val="en-US"/>
+        </w:rPr>
+      </w:pPr>
+      <w:r>
+        <w:rPr>
+          <w:rFonts w:ascii="Times New Roman" w:hAnsi="Times New Roman" w:cs="Times New Roman"/>
+          <w:lang w:val="en-US"/>
+        </w:rPr>
+        <w:t xml:space="preserve">    for </w:t>
+      </w:r>
+      <w:proofErr w:type="spellStart"/>
+      <w:proofErr w:type="gramStart"/>
+      <w:r>
+        <w:rPr>
+          <w:rFonts w:ascii="Times New Roman" w:hAnsi="Times New Roman" w:cs="Times New Roman"/>
+          <w:lang w:val="en-US"/>
+        </w:rPr>
+        <w:t>sc.Scan</w:t>
+      </w:r>
+      <w:proofErr w:type="spellEnd"/>
+      <w:proofErr w:type="gramEnd"/>
+      <w:r>
+        <w:rPr>
+          <w:rFonts w:ascii="Times New Roman" w:hAnsi="Times New Roman" w:cs="Times New Roman"/>
+          <w:lang w:val="en-US"/>
+        </w:rPr>
+        <w:t>() {</w:t>
+      </w:r>
+    </w:p>
+    <w:p>
+      <w:pPr>
+        <w:spacing w:line="360" w:lineRule="auto"/>
+        <w:jc w:val="both"/>
+        <w:rPr>
+          <w:rFonts w:ascii="Times New Roman" w:hAnsi="Times New Roman" w:cs="Times New Roman"/>
+          <w:lang w:val="en-US"/>
+        </w:rPr>
+      </w:pPr>
+      <w:r>
+        <w:rPr>
+          <w:rFonts w:ascii="Times New Roman" w:hAnsi="Times New Roman" w:cs="Times New Roman"/>
+          <w:lang w:val="en-US"/>
+        </w:rPr>
+        <w:t xml:space="preserve">        </w:t>
+      </w:r>
+      <w:proofErr w:type="gramStart"/>
+      <w:r>
+        <w:rPr>
+          <w:rFonts w:ascii="Times New Roman" w:hAnsi="Times New Roman" w:cs="Times New Roman"/>
+          <w:lang w:val="en-US"/>
+        </w:rPr>
+        <w:t>parts :</w:t>
+      </w:r>
+      <w:proofErr w:type="gramEnd"/>
+      <w:r>
+        <w:rPr>
+          <w:rFonts w:ascii="Times New Roman" w:hAnsi="Times New Roman" w:cs="Times New Roman"/>
+          <w:lang w:val="en-US"/>
+        </w:rPr>
+        <w:t xml:space="preserve">= </w:t>
+      </w:r>
+      <w:proofErr w:type="spellStart"/>
+      <w:proofErr w:type="gramStart"/>
+      <w:r>
+        <w:rPr>
+          <w:rFonts w:ascii="Times New Roman" w:hAnsi="Times New Roman" w:cs="Times New Roman"/>
+          <w:lang w:val="en-US"/>
+        </w:rPr>
+        <w:t>strings.Fields</w:t>
+      </w:r>
+      <w:proofErr w:type="spellEnd"/>
+      <w:proofErr w:type="gramEnd"/>
+      <w:r>
+        <w:rPr>
+          <w:rFonts w:ascii="Times New Roman" w:hAnsi="Times New Roman" w:cs="Times New Roman"/>
+          <w:lang w:val="en-US"/>
+        </w:rPr>
+        <w:t>(</w:t>
+      </w:r>
+      <w:proofErr w:type="spellStart"/>
+      <w:proofErr w:type="gramStart"/>
+      <w:r>
+        <w:rPr>
+          <w:rFonts w:ascii="Times New Roman" w:hAnsi="Times New Roman" w:cs="Times New Roman"/>
+          <w:lang w:val="en-US"/>
+        </w:rPr>
+        <w:t>sc.Text</w:t>
+      </w:r>
+      <w:proofErr w:type="spellEnd"/>
+      <w:proofErr w:type="gramEnd"/>
+      <w:r>
+        <w:rPr>
+          <w:rFonts w:ascii="Times New Roman" w:hAnsi="Times New Roman" w:cs="Times New Roman"/>
+          <w:lang w:val="en-US"/>
+        </w:rPr>
+        <w:t>())</w:t>
+      </w:r>
+    </w:p>
+    <w:p>
+      <w:pPr>
+        <w:spacing w:line="360" w:lineRule="auto"/>
+        <w:jc w:val="both"/>
+        <w:rPr>
+          <w:rFonts w:ascii="Times New Roman" w:hAnsi="Times New Roman" w:cs="Times New Roman"/>
+          <w:lang w:val="en-US"/>
+        </w:rPr>
+      </w:pPr>
+      <w:r>
+        <w:rPr>
+          <w:rFonts w:ascii="Times New Roman" w:hAnsi="Times New Roman" w:cs="Times New Roman"/>
+          <w:lang w:val="en-US"/>
+        </w:rPr>
+        <w:t xml:space="preserve">        if </w:t>
+      </w:r>
+      <w:proofErr w:type="spellStart"/>
+      <w:r>
+        <w:rPr>
+          <w:rFonts w:ascii="Times New Roman" w:hAnsi="Times New Roman" w:cs="Times New Roman"/>
+          <w:lang w:val="en-US"/>
+        </w:rPr>
+        <w:t>len</w:t>
+      </w:r>
+      <w:proofErr w:type="spellEnd"/>
+      <w:r>
+        <w:rPr>
+          <w:rFonts w:ascii="Times New Roman" w:hAnsi="Times New Roman" w:cs="Times New Roman"/>
+          <w:lang w:val="en-US"/>
+        </w:rPr>
+        <w:t xml:space="preserve">(parts) == 0 </w:t>
+      </w:r>
+      <w:proofErr w:type="gramStart"/>
+      <w:r>
+        <w:rPr>
+          <w:rFonts w:ascii="Times New Roman" w:hAnsi="Times New Roman" w:cs="Times New Roman"/>
+          <w:lang w:val="en-US"/>
+        </w:rPr>
+        <w:t>{ continue</w:t>
+      </w:r>
+      <w:proofErr w:type="gramEnd"/>
+      <w:r>
+        <w:rPr>
+          <w:rFonts w:ascii="Times New Roman" w:hAnsi="Times New Roman" w:cs="Times New Roman"/>
+          <w:lang w:val="en-US"/>
+        </w:rPr>
+        <w:t xml:space="preserve"> }</w:t>
+      </w:r>
+    </w:p>
+    <w:p>
+      <w:pPr>
+        <w:spacing w:line="360" w:lineRule="auto"/>
+        <w:jc w:val="both"/>
+        <w:rPr>
+          <w:rFonts w:ascii="Times New Roman" w:hAnsi="Times New Roman" w:cs="Times New Roman"/>
+          <w:lang w:val="en-US"/>
+        </w:rPr>
+      </w:pPr>
+    </w:p>
+    <w:p>
+      <w:pPr>
+        <w:spacing w:line="360" w:lineRule="auto"/>
+        <w:jc w:val="both"/>
+        <w:rPr>
+          <w:rFonts w:ascii="Times New Roman" w:hAnsi="Times New Roman" w:cs="Times New Roman"/>
+          <w:lang w:val="en-US"/>
+        </w:rPr>
+      </w:pPr>
+      <w:r>
+        <w:rPr>
+          <w:rFonts w:ascii="Times New Roman" w:hAnsi="Times New Roman" w:cs="Times New Roman"/>
+          <w:lang w:val="en-US"/>
+        </w:rPr>
+        <w:t xml:space="preserve">        </w:t>
+      </w:r>
+      <w:proofErr w:type="gramStart"/>
+      <w:r>
+        <w:rPr>
+          <w:rFonts w:ascii="Times New Roman" w:hAnsi="Times New Roman" w:cs="Times New Roman"/>
+          <w:lang w:val="en-US"/>
+        </w:rPr>
+        <w:t>fam :</w:t>
+      </w:r>
+      <w:proofErr w:type="gramEnd"/>
+      <w:r>
+        <w:rPr>
+          <w:rFonts w:ascii="Times New Roman" w:hAnsi="Times New Roman" w:cs="Times New Roman"/>
+          <w:lang w:val="en-US"/>
+        </w:rPr>
+        <w:t xml:space="preserve">= </w:t>
+      </w:r>
+      <w:proofErr w:type="gramStart"/>
+      <w:r>
+        <w:rPr>
+          <w:rFonts w:ascii="Times New Roman" w:hAnsi="Times New Roman" w:cs="Times New Roman"/>
+          <w:lang w:val="en-US"/>
+        </w:rPr>
+        <w:t>parts[</w:t>
+      </w:r>
+      <w:proofErr w:type="gramEnd"/>
+      <w:r>
+        <w:rPr>
+          <w:rFonts w:ascii="Times New Roman" w:hAnsi="Times New Roman" w:cs="Times New Roman"/>
+          <w:lang w:val="en-US"/>
+        </w:rPr>
+        <w:t>0]</w:t>
+      </w:r>
+    </w:p>
+    <w:p>
+      <w:pPr>
+        <w:spacing w:line="360" w:lineRule="auto"/>
+        <w:jc w:val="both"/>
+        <w:rPr>
+          <w:rFonts w:ascii="Times New Roman" w:hAnsi="Times New Roman" w:cs="Times New Roman"/>
+          <w:lang w:val="en-US"/>
+        </w:rPr>
+      </w:pPr>
+      <w:r>
+        <w:rPr>
+          <w:rFonts w:ascii="Times New Roman" w:hAnsi="Times New Roman" w:cs="Times New Roman"/>
+          <w:lang w:val="en-US"/>
+        </w:rPr>
+        <w:t xml:space="preserve">        </w:t>
+      </w:r>
+      <w:proofErr w:type="gramStart"/>
+      <w:r>
+        <w:rPr>
+          <w:rFonts w:ascii="Times New Roman" w:hAnsi="Times New Roman" w:cs="Times New Roman"/>
+          <w:lang w:val="en-US"/>
+        </w:rPr>
+        <w:t>prize :</w:t>
+      </w:r>
+      <w:proofErr w:type="gramEnd"/>
+      <w:r>
+        <w:rPr>
+          <w:rFonts w:ascii="Times New Roman" w:hAnsi="Times New Roman" w:cs="Times New Roman"/>
+          <w:lang w:val="en-US"/>
+        </w:rPr>
+        <w:t>= false</w:t>
+      </w:r>
+    </w:p>
+    <w:p>
+      <w:pPr>
+        <w:spacing w:line="360" w:lineRule="auto"/>
+        <w:jc w:val="both"/>
+        <w:rPr>
+          <w:rFonts w:ascii="Times New Roman" w:hAnsi="Times New Roman" w:cs="Times New Roman"/>
+          <w:lang w:val="en-US"/>
+        </w:rPr>
+      </w:pPr>
+      <w:r>
+        <w:rPr>
+          <w:rFonts w:ascii="Times New Roman" w:hAnsi="Times New Roman" w:cs="Times New Roman"/>
+          <w:lang w:val="en-US"/>
+        </w:rPr>
+        <w:t xml:space="preserve">        if </w:t>
+      </w:r>
+      <w:proofErr w:type="spellStart"/>
+      <w:r>
+        <w:rPr>
+          <w:rFonts w:ascii="Times New Roman" w:hAnsi="Times New Roman" w:cs="Times New Roman"/>
+          <w:lang w:val="en-US"/>
+        </w:rPr>
+        <w:t>len</w:t>
+      </w:r>
+      <w:proofErr w:type="spellEnd"/>
+      <w:r>
+        <w:rPr>
+          <w:rFonts w:ascii="Times New Roman" w:hAnsi="Times New Roman" w:cs="Times New Roman"/>
+          <w:lang w:val="en-US"/>
+        </w:rPr>
+        <w:t>(parts) &gt; 1 {</w:t>
+      </w:r>
+    </w:p>
+    <w:p>
+      <w:pPr>
+        <w:spacing w:line="360" w:lineRule="auto"/>
+        <w:jc w:val="both"/>
+        <w:rPr>
+          <w:rFonts w:ascii="Times New Roman" w:hAnsi="Times New Roman" w:cs="Times New Roman"/>
+          <w:lang w:val="en-US"/>
+        </w:rPr>
+      </w:pPr>
+      <w:r>
+        <w:rPr>
+          <w:rFonts w:ascii="Times New Roman" w:hAnsi="Times New Roman" w:cs="Times New Roman"/>
+          <w:lang w:val="en-US"/>
+        </w:rPr>
+        <w:t xml:space="preserve">            </w:t>
+      </w:r>
+      <w:proofErr w:type="gramStart"/>
+      <w:r>
+        <w:rPr>
+          <w:rFonts w:ascii="Times New Roman" w:hAnsi="Times New Roman" w:cs="Times New Roman"/>
+          <w:lang w:val="en-US"/>
+        </w:rPr>
+        <w:t>p :</w:t>
+      </w:r>
+      <w:proofErr w:type="gramEnd"/>
+      <w:r>
+        <w:rPr>
+          <w:rFonts w:ascii="Times New Roman" w:hAnsi="Times New Roman" w:cs="Times New Roman"/>
+          <w:lang w:val="en-US"/>
+        </w:rPr>
+        <w:t xml:space="preserve">= </w:t>
+      </w:r>
+      <w:proofErr w:type="gramStart"/>
+      <w:r>
+        <w:rPr>
+          <w:rFonts w:ascii="Times New Roman" w:hAnsi="Times New Roman" w:cs="Times New Roman"/>
+          <w:lang w:val="en-US"/>
+        </w:rPr>
+        <w:t>parts[</w:t>
+      </w:r>
+      <w:proofErr w:type="gramEnd"/>
+      <w:r>
+        <w:rPr>
+          <w:rFonts w:ascii="Times New Roman" w:hAnsi="Times New Roman" w:cs="Times New Roman"/>
+          <w:lang w:val="en-US"/>
+        </w:rPr>
+        <w:t>1]</w:t>
       </w:r>
     </w:p>
     <w:p>
@@ -2862,25 +3940,98 @@
           <w:rFonts w:ascii="Times New Roman" w:hAnsi="Times New Roman" w:cs="Times New Roman"/>
           <w:lang w:val="en-US"/>
         </w:rPr>
-        <w:t xml:space="preserve">        if val, ok := m[fam]; ok {</w:t>
-      </w:r>
-    </w:p>
-    <w:p>
-      <w:pPr>
-        <w:spacing w:line="360" w:lineRule="auto"/>
-        <w:jc w:val="both"/>
-        <w:rPr>
-          <w:rFonts w:ascii="Times New Roman" w:hAnsi="Times New Roman" w:cs="Times New Roman"/>
-          <w:lang w:val="en-US"/>
-        </w:rPr>
-      </w:pPr>
-      <w:r>
-        <w:rPr>
-          <w:rFonts w:ascii="Times New Roman" w:hAnsi="Times New Roman" w:cs="Times New Roman"/>
-          <w:lang w:val="en-US"/>
-        </w:rPr>
-        <w:t xml:space="preserve">            if val { prize = true }</w:t>
-      </w:r>
+        <w:t xml:space="preserve">        if </w:t>
+      </w:r>
+      <w:proofErr w:type="spellStart"/>
+      <w:r>
+        <w:rPr>
+          <w:rFonts w:ascii="Times New Roman" w:hAnsi="Times New Roman" w:cs="Times New Roman"/>
+          <w:lang w:val="en-US"/>
+        </w:rPr>
+        <w:t>val</w:t>
+      </w:r>
+      <w:proofErr w:type="spellEnd"/>
+      <w:r>
+        <w:rPr>
+          <w:rFonts w:ascii="Times New Roman" w:hAnsi="Times New Roman" w:cs="Times New Roman"/>
+          <w:lang w:val="en-US"/>
+        </w:rPr>
+        <w:t xml:space="preserve">, </w:t>
+      </w:r>
+      <w:proofErr w:type="gramStart"/>
+      <w:r>
+        <w:rPr>
+          <w:rFonts w:ascii="Times New Roman" w:hAnsi="Times New Roman" w:cs="Times New Roman"/>
+          <w:lang w:val="en-US"/>
+        </w:rPr>
+        <w:t>ok :</w:t>
+      </w:r>
+      <w:proofErr w:type="gramEnd"/>
+      <w:r>
+        <w:rPr>
+          <w:rFonts w:ascii="Times New Roman" w:hAnsi="Times New Roman" w:cs="Times New Roman"/>
+          <w:lang w:val="en-US"/>
+        </w:rPr>
+        <w:t>= m[fam]; ok {</w:t>
+      </w:r>
+    </w:p>
+    <w:p>
+      <w:pPr>
+        <w:spacing w:line="360" w:lineRule="auto"/>
+        <w:jc w:val="both"/>
+        <w:rPr>
+          <w:rFonts w:ascii="Times New Roman" w:hAnsi="Times New Roman" w:cs="Times New Roman"/>
+          <w:lang w:val="en-US"/>
+        </w:rPr>
+      </w:pPr>
+      <w:r>
+        <w:rPr>
+          <w:rFonts w:ascii="Times New Roman" w:hAnsi="Times New Roman" w:cs="Times New Roman"/>
+          <w:lang w:val="en-US"/>
+        </w:rPr>
+        <w:t xml:space="preserve">            if </w:t>
+      </w:r>
+      <w:proofErr w:type="spellStart"/>
+      <w:r>
+        <w:rPr>
+          <w:rFonts w:ascii="Times New Roman" w:hAnsi="Times New Roman" w:cs="Times New Roman"/>
+          <w:lang w:val="en-US"/>
+        </w:rPr>
+        <w:t>val</w:t>
+      </w:r>
+      <w:proofErr w:type="spellEnd"/>
+      <w:r>
+        <w:rPr>
+          <w:rFonts w:ascii="Times New Roman" w:hAnsi="Times New Roman" w:cs="Times New Roman"/>
+          <w:lang w:val="en-US"/>
+        </w:rPr>
+        <w:t xml:space="preserve"> </w:t>
+      </w:r>
+      <w:proofErr w:type="gramStart"/>
+      <w:r>
+        <w:rPr>
+          <w:rFonts w:ascii="Times New Roman" w:hAnsi="Times New Roman" w:cs="Times New Roman"/>
+          <w:lang w:val="en-US"/>
+        </w:rPr>
+        <w:t>{ prize</w:t>
+      </w:r>
+      <w:proofErr w:type="gramEnd"/>
+      <w:r>
+        <w:rPr>
+          <w:rFonts w:ascii="Times New Roman" w:hAnsi="Times New Roman" w:cs="Times New Roman"/>
+          <w:lang w:val="en-US"/>
+        </w:rPr>
+        <w:t xml:space="preserve"> = </w:t>
+      </w:r>
+      <w:proofErr w:type="gramStart"/>
+      <w:r>
+        <w:rPr>
+          <w:rFonts w:ascii="Times New Roman" w:hAnsi="Times New Roman" w:cs="Times New Roman"/>
+          <w:lang w:val="en-US"/>
+        </w:rPr>
+        <w:t>true }</w:t>
+      </w:r>
+      <w:proofErr w:type="gramEnd"/>
     </w:p>
     <w:p>
       <w:pPr>
@@ -2950,7 +4101,21 @@
         <w:rPr>
           <w:rFonts w:ascii="Times New Roman" w:hAnsi="Times New Roman" w:cs="Times New Roman"/>
         </w:rPr>
-        <w:t xml:space="preserve">    return m</w:t>
+        <w:t xml:space="preserve">    </w:t>
+      </w:r>
+      <w:proofErr w:type="spellStart"/>
+      <w:r>
+        <w:rPr>
+          <w:rFonts w:ascii="Times New Roman" w:hAnsi="Times New Roman" w:cs="Times New Roman"/>
+        </w:rPr>
+        <w:t>return</w:t>
+      </w:r>
+      <w:proofErr w:type="spellEnd"/>
+      <w:r>
+        <w:rPr>
+          <w:rFonts w:ascii="Times New Roman" w:hAnsi="Times New Roman" w:cs="Times New Roman"/>
+        </w:rPr>
+        <w:t xml:space="preserve"> m</w:t>
       </w:r>
     </w:p>
     <w:p>
@@ -3049,8 +4214,82 @@
           <w:sz w:val="27"/>
           <w:szCs w:val="27"/>
         </w:rPr>
-        <w:t>2. Простые структуры: map[string]bool и []string</w:t>
-      </w:r>
+        <w:t xml:space="preserve">2. Простые структуры: </w:t>
+      </w:r>
+      <w:proofErr w:type="spellStart"/>
+      <w:r>
+        <w:rPr>
+          <w:rFonts w:ascii="Times New Roman" w:hAnsi="Times New Roman" w:cs="Times New Roman"/>
+          <w:sz w:val="27"/>
+          <w:szCs w:val="27"/>
+        </w:rPr>
+        <w:t>map</w:t>
+      </w:r>
+      <w:proofErr w:type="spellEnd"/>
+      <w:r>
+        <w:rPr>
+          <w:rFonts w:ascii="Times New Roman" w:hAnsi="Times New Roman" w:cs="Times New Roman"/>
+          <w:sz w:val="27"/>
+          <w:szCs w:val="27"/>
+        </w:rPr>
+        <w:t>[</w:t>
+      </w:r>
+      <w:proofErr w:type="spellStart"/>
+      <w:r>
+        <w:rPr>
+          <w:rFonts w:ascii="Times New Roman" w:hAnsi="Times New Roman" w:cs="Times New Roman"/>
+          <w:sz w:val="27"/>
+          <w:szCs w:val="27"/>
+        </w:rPr>
+        <w:t>string</w:t>
+      </w:r>
+      <w:proofErr w:type="spellEnd"/>
+      <w:r>
+        <w:rPr>
+          <w:rFonts w:ascii="Times New Roman" w:hAnsi="Times New Roman" w:cs="Times New Roman"/>
+          <w:sz w:val="27"/>
+          <w:szCs w:val="27"/>
+        </w:rPr>
+        <w:t>]</w:t>
+      </w:r>
+      <w:proofErr w:type="spellStart"/>
+      <w:r>
+        <w:rPr>
+          <w:rFonts w:ascii="Times New Roman" w:hAnsi="Times New Roman" w:cs="Times New Roman"/>
+          <w:sz w:val="27"/>
+          <w:szCs w:val="27"/>
+        </w:rPr>
+        <w:t>bool</w:t>
+      </w:r>
+      <w:proofErr w:type="spellEnd"/>
+      <w:r>
+        <w:rPr>
+          <w:rFonts w:ascii="Times New Roman" w:hAnsi="Times New Roman" w:cs="Times New Roman"/>
+          <w:sz w:val="27"/>
+          <w:szCs w:val="27"/>
+        </w:rPr>
+        <w:t xml:space="preserve"> и </w:t>
+      </w:r>
+      <w:proofErr w:type="gramStart"/>
+      <w:r>
+        <w:rPr>
+          <w:rFonts w:ascii="Times New Roman" w:hAnsi="Times New Roman" w:cs="Times New Roman"/>
+          <w:sz w:val="27"/>
+          <w:szCs w:val="27"/>
+        </w:rPr>
+        <w:t>[]</w:t>
+      </w:r>
+      <w:proofErr w:type="spellStart"/>
+      <w:r>
+        <w:rPr>
+          <w:rFonts w:ascii="Times New Roman" w:hAnsi="Times New Roman" w:cs="Times New Roman"/>
+          <w:sz w:val="27"/>
+          <w:szCs w:val="27"/>
+        </w:rPr>
+        <w:t>string</w:t>
+      </w:r>
+      <w:proofErr w:type="spellEnd"/>
+      <w:proofErr w:type="gramEnd"/>
     </w:p>
     <w:p>
       <w:pPr>
@@ -3301,7 +4540,81 @@
           <w:sz w:val="27"/>
           <w:szCs w:val="27"/>
         </w:rPr>
-        <w:t>Код написан в декларативном стиле: "результат — это...". Используются множества,словари, встроенные функции (set, sorted). Логика более компактная благодарятернарным операторам и высокоуровневым абстракциям.</w:t>
+        <w:t xml:space="preserve">Код написан в декларативном стиле: "результат — это...". Используются </w:t>
+      </w:r>
+      <w:proofErr w:type="spellStart"/>
+      <w:proofErr w:type="gramStart"/>
+      <w:r>
+        <w:rPr>
+          <w:rFonts w:ascii="Times New Roman" w:hAnsi="Times New Roman" w:cs="Times New Roman"/>
+          <w:sz w:val="27"/>
+          <w:szCs w:val="27"/>
+        </w:rPr>
+        <w:t>множества,словари</w:t>
+      </w:r>
+      <w:proofErr w:type="spellEnd"/>
+      <w:proofErr w:type="gramEnd"/>
+      <w:r>
+        <w:rPr>
+          <w:rFonts w:ascii="Times New Roman" w:hAnsi="Times New Roman" w:cs="Times New Roman"/>
+          <w:sz w:val="27"/>
+          <w:szCs w:val="27"/>
+        </w:rPr>
+        <w:t>, встроенные функции (</w:t>
+      </w:r>
+      <w:proofErr w:type="spellStart"/>
+      <w:r>
+        <w:rPr>
+          <w:rFonts w:ascii="Times New Roman" w:hAnsi="Times New Roman" w:cs="Times New Roman"/>
+          <w:sz w:val="27"/>
+          <w:szCs w:val="27"/>
+        </w:rPr>
+        <w:t>set</w:t>
+      </w:r>
+      <w:proofErr w:type="spellEnd"/>
+      <w:r>
+        <w:rPr>
+          <w:rFonts w:ascii="Times New Roman" w:hAnsi="Times New Roman" w:cs="Times New Roman"/>
+          <w:sz w:val="27"/>
+          <w:szCs w:val="27"/>
+        </w:rPr>
+        <w:t xml:space="preserve">, </w:t>
+      </w:r>
+      <w:proofErr w:type="spellStart"/>
+      <w:r>
+        <w:rPr>
+          <w:rFonts w:ascii="Times New Roman" w:hAnsi="Times New Roman" w:cs="Times New Roman"/>
+          <w:sz w:val="27"/>
+          <w:szCs w:val="27"/>
+        </w:rPr>
+        <w:t>sorted</w:t>
+      </w:r>
+      <w:proofErr w:type="spellEnd"/>
+      <w:r>
+        <w:rPr>
+          <w:rFonts w:ascii="Times New Roman" w:hAnsi="Times New Roman" w:cs="Times New Roman"/>
+          <w:sz w:val="27"/>
+          <w:szCs w:val="27"/>
+        </w:rPr>
+        <w:t xml:space="preserve">). Логика более компактная </w:t>
+      </w:r>
+      <w:proofErr w:type="spellStart"/>
+      <w:r>
+        <w:rPr>
+          <w:rFonts w:ascii="Times New Roman" w:hAnsi="Times New Roman" w:cs="Times New Roman"/>
+          <w:sz w:val="27"/>
+          <w:szCs w:val="27"/>
+        </w:rPr>
+        <w:t>благодарятернарным</w:t>
+      </w:r>
+      <w:proofErr w:type="spellEnd"/>
+      <w:r>
+        <w:rPr>
+          <w:rFonts w:ascii="Times New Roman" w:hAnsi="Times New Roman" w:cs="Times New Roman"/>
+          <w:sz w:val="27"/>
+          <w:szCs w:val="27"/>
+        </w:rPr>
+        <w:t xml:space="preserve"> операторам и высокоуровневым абстракциям.</w:t>
       </w:r>
     </w:p>
     <w:p>
@@ -3341,7 +4654,23 @@
           <w:rFonts w:ascii="Times New Roman" w:hAnsi="Times New Roman" w:cs="Times New Roman"/>
           <w:lang w:val="en-US"/>
         </w:rPr>
-        <w:t>def read_olympiad_file(filename):</w:t>
+        <w:t xml:space="preserve">def </w:t>
+      </w:r>
+      <w:proofErr w:type="spellStart"/>
+      <w:r>
+        <w:rPr>
+          <w:rFonts w:ascii="Times New Roman" w:hAnsi="Times New Roman" w:cs="Times New Roman"/>
+          <w:lang w:val="en-US"/>
+        </w:rPr>
+        <w:t>read_olympiad_file</w:t>
+      </w:r>
+      <w:proofErr w:type="spellEnd"/>
+      <w:r>
+        <w:rPr>
+          <w:rFonts w:ascii="Times New Roman" w:hAnsi="Times New Roman" w:cs="Times New Roman"/>
+          <w:lang w:val="en-US"/>
+        </w:rPr>
+        <w:t>(filename):</w:t>
       </w:r>
     </w:p>
     <w:p>
@@ -3363,7 +4692,21 @@
         <w:rPr>
           <w:rFonts w:ascii="Times New Roman" w:hAnsi="Times New Roman" w:cs="Times New Roman"/>
         </w:rPr>
-        <w:t>"""Читает файл олимпиады, возвращает словарь {фамилия: наличие_приза}"""</w:t>
+        <w:t xml:space="preserve">"""Читает файл олимпиады, возвращает словарь {фамилия: </w:t>
+      </w:r>
+      <w:proofErr w:type="spellStart"/>
+      <w:r>
+        <w:rPr>
+          <w:rFonts w:ascii="Times New Roman" w:hAnsi="Times New Roman" w:cs="Times New Roman"/>
+        </w:rPr>
+        <w:t>наличие_приза</w:t>
+      </w:r>
+      <w:proofErr w:type="spellEnd"/>
+      <w:r>
+        <w:rPr>
+          <w:rFonts w:ascii="Times New Roman" w:hAnsi="Times New Roman" w:cs="Times New Roman"/>
+        </w:rPr>
+        <w:t>}"""</w:t>
       </w:r>
     </w:p>
     <w:p>
@@ -3403,7 +4746,23 @@
           <w:rFonts w:ascii="Times New Roman" w:hAnsi="Times New Roman" w:cs="Times New Roman"/>
           <w:lang w:val="en-US"/>
         </w:rPr>
-        <w:t xml:space="preserve">    with open(filename, 'r', encoding='utf-8') as f:</w:t>
+        <w:t xml:space="preserve">    with </w:t>
+      </w:r>
+      <w:proofErr w:type="gramStart"/>
+      <w:r>
+        <w:rPr>
+          <w:rFonts w:ascii="Times New Roman" w:hAnsi="Times New Roman" w:cs="Times New Roman"/>
+          <w:lang w:val="en-US"/>
+        </w:rPr>
+        <w:t>open(</w:t>
+      </w:r>
+      <w:proofErr w:type="gramEnd"/>
+      <w:r>
+        <w:rPr>
+          <w:rFonts w:ascii="Times New Roman" w:hAnsi="Times New Roman" w:cs="Times New Roman"/>
+          <w:lang w:val="en-US"/>
+        </w:rPr>
+        <w:t>filename, 'r', encoding='utf-8') as f:</w:t>
       </w:r>
     </w:p>
     <w:p>
@@ -3437,7 +4796,25 @@
           <w:rFonts w:ascii="Times New Roman" w:hAnsi="Times New Roman" w:cs="Times New Roman"/>
           <w:lang w:val="en-US"/>
         </w:rPr>
-        <w:t xml:space="preserve">            line = line.strip()</w:t>
+        <w:t xml:space="preserve">            line = </w:t>
+      </w:r>
+      <w:proofErr w:type="spellStart"/>
+      <w:proofErr w:type="gramStart"/>
+      <w:r>
+        <w:rPr>
+          <w:rFonts w:ascii="Times New Roman" w:hAnsi="Times New Roman" w:cs="Times New Roman"/>
+          <w:lang w:val="en-US"/>
+        </w:rPr>
+        <w:t>line.strip</w:t>
+      </w:r>
+      <w:proofErr w:type="spellEnd"/>
+      <w:proofErr w:type="gramEnd"/>
+      <w:r>
+        <w:rPr>
+          <w:rFonts w:ascii="Times New Roman" w:hAnsi="Times New Roman" w:cs="Times New Roman"/>
+          <w:lang w:val="en-US"/>
+        </w:rPr>
+        <w:t>()</w:t>
       </w:r>
     </w:p>
     <w:p>
@@ -3506,41 +4883,58 @@
           <w:rFonts w:ascii="Times New Roman" w:hAnsi="Times New Roman" w:cs="Times New Roman"/>
           <w:lang w:val="en-US"/>
         </w:rPr>
-        <w:t xml:space="preserve">            parts = line.split()</w:t>
-      </w:r>
-    </w:p>
-    <w:p>
-      <w:pPr>
-        <w:spacing w:line="360" w:lineRule="auto"/>
-        <w:jc w:val="both"/>
-        <w:rPr>
-          <w:rFonts w:ascii="Times New Roman" w:hAnsi="Times New Roman" w:cs="Times New Roman"/>
-          <w:lang w:val="en-US"/>
-        </w:rPr>
-      </w:pPr>
-      <w:r>
-        <w:rPr>
-          <w:rFonts w:ascii="Times New Roman" w:hAnsi="Times New Roman" w:cs="Times New Roman"/>
-          <w:lang w:val="en-US"/>
-        </w:rPr>
-        <w:t xml:space="preserve">            surname = parts[0]</w:t>
-      </w:r>
-    </w:p>
-    <w:p>
-      <w:pPr>
-        <w:spacing w:line="360" w:lineRule="auto"/>
-        <w:jc w:val="both"/>
-        <w:rPr>
-          <w:rFonts w:ascii="Times New Roman" w:hAnsi="Times New Roman" w:cs="Times New Roman"/>
-          <w:lang w:val="en-US"/>
-        </w:rPr>
-      </w:pPr>
-      <w:r>
-        <w:rPr>
-          <w:rFonts w:ascii="Times New Roman" w:hAnsi="Times New Roman" w:cs="Times New Roman"/>
-          <w:lang w:val="en-US"/>
-        </w:rPr>
-        <w:t xml:space="preserve">            has_prize = len(parts) &gt; 1 and parts[1] in ['1', '2', '3']</w:t>
+        <w:t xml:space="preserve">            parts = </w:t>
+      </w:r>
+      <w:proofErr w:type="spellStart"/>
+      <w:proofErr w:type="gramStart"/>
+      <w:r>
+        <w:rPr>
+          <w:rFonts w:ascii="Times New Roman" w:hAnsi="Times New Roman" w:cs="Times New Roman"/>
+          <w:lang w:val="en-US"/>
+        </w:rPr>
+        <w:t>line.split</w:t>
+      </w:r>
+      <w:proofErr w:type="spellEnd"/>
+      <w:proofErr w:type="gramEnd"/>
+      <w:r>
+        <w:rPr>
+          <w:rFonts w:ascii="Times New Roman" w:hAnsi="Times New Roman" w:cs="Times New Roman"/>
+          <w:lang w:val="en-US"/>
+        </w:rPr>
+        <w:t>()</w:t>
+      </w:r>
+    </w:p>
+    <w:p>
+      <w:pPr>
+        <w:spacing w:line="360" w:lineRule="auto"/>
+        <w:jc w:val="both"/>
+        <w:rPr>
+          <w:rFonts w:ascii="Times New Roman" w:hAnsi="Times New Roman" w:cs="Times New Roman"/>
+          <w:lang w:val="en-US"/>
+        </w:rPr>
+      </w:pPr>
+      <w:r>
+        <w:rPr>
+          <w:rFonts w:ascii="Times New Roman" w:hAnsi="Times New Roman" w:cs="Times New Roman"/>
+          <w:lang w:val="en-US"/>
+        </w:rPr>
+        <w:t xml:space="preserve">            surname = </w:t>
+      </w:r>
+      <w:proofErr w:type="gramStart"/>
+      <w:r>
+        <w:rPr>
+          <w:rFonts w:ascii="Times New Roman" w:hAnsi="Times New Roman" w:cs="Times New Roman"/>
+          <w:lang w:val="en-US"/>
+        </w:rPr>
+        <w:t>parts[</w:t>
+      </w:r>
+      <w:proofErr w:type="gramEnd"/>
+      <w:r>
+        <w:rPr>
+          <w:rFonts w:ascii="Times New Roman" w:hAnsi="Times New Roman" w:cs="Times New Roman"/>
+          <w:lang w:val="en-US"/>
+        </w:rPr>
+        <w:t>0]</w:t>
       </w:r>
     </w:p>
     <w:p>
@@ -3559,6 +4953,71 @@
         </w:rPr>
         <w:t xml:space="preserve">            </w:t>
       </w:r>
+      <w:proofErr w:type="spellStart"/>
+      <w:r>
+        <w:rPr>
+          <w:rFonts w:ascii="Times New Roman" w:hAnsi="Times New Roman" w:cs="Times New Roman"/>
+          <w:lang w:val="en-US"/>
+        </w:rPr>
+        <w:t>has_prize</w:t>
+      </w:r>
+      <w:proofErr w:type="spellEnd"/>
+      <w:r>
+        <w:rPr>
+          <w:rFonts w:ascii="Times New Roman" w:hAnsi="Times New Roman" w:cs="Times New Roman"/>
+          <w:lang w:val="en-US"/>
+        </w:rPr>
+        <w:t xml:space="preserve"> = </w:t>
+      </w:r>
+      <w:proofErr w:type="spellStart"/>
+      <w:r>
+        <w:rPr>
+          <w:rFonts w:ascii="Times New Roman" w:hAnsi="Times New Roman" w:cs="Times New Roman"/>
+          <w:lang w:val="en-US"/>
+        </w:rPr>
+        <w:t>len</w:t>
+      </w:r>
+      <w:proofErr w:type="spellEnd"/>
+      <w:r>
+        <w:rPr>
+          <w:rFonts w:ascii="Times New Roman" w:hAnsi="Times New Roman" w:cs="Times New Roman"/>
+          <w:lang w:val="en-US"/>
+        </w:rPr>
+        <w:t xml:space="preserve">(parts) &gt; 1 and </w:t>
+      </w:r>
+      <w:proofErr w:type="gramStart"/>
+      <w:r>
+        <w:rPr>
+          <w:rFonts w:ascii="Times New Roman" w:hAnsi="Times New Roman" w:cs="Times New Roman"/>
+          <w:lang w:val="en-US"/>
+        </w:rPr>
+        <w:t>parts[</w:t>
+      </w:r>
+      <w:proofErr w:type="gramEnd"/>
+      <w:r>
+        <w:rPr>
+          <w:rFonts w:ascii="Times New Roman" w:hAnsi="Times New Roman" w:cs="Times New Roman"/>
+          <w:lang w:val="en-US"/>
+        </w:rPr>
+        <w:t>1] in ['1', '2', '3']</w:t>
+      </w:r>
+    </w:p>
+    <w:p>
+      <w:pPr>
+        <w:spacing w:line="360" w:lineRule="auto"/>
+        <w:jc w:val="both"/>
+        <w:rPr>
+          <w:rFonts w:ascii="Times New Roman" w:hAnsi="Times New Roman" w:cs="Times New Roman"/>
+          <w:lang w:val="en-US"/>
+        </w:rPr>
+      </w:pPr>
+      <w:r>
+        <w:rPr>
+          <w:rFonts w:ascii="Times New Roman" w:hAnsi="Times New Roman" w:cs="Times New Roman"/>
+          <w:lang w:val="en-US"/>
+        </w:rPr>
+        <w:t xml:space="preserve">            </w:t>
+      </w:r>
     </w:p>
     <w:p>
       <w:pPr>
@@ -3591,8 +5050,17 @@
           <w:rFonts w:ascii="Times New Roman" w:hAnsi="Times New Roman" w:cs="Times New Roman"/>
           <w:lang w:val="en-US"/>
         </w:rPr>
-        <w:t xml:space="preserve">                students[surname] = students[surname] or has_prize</w:t>
-      </w:r>
+        <w:t xml:space="preserve">                students[surname] = students[surname] or </w:t>
+      </w:r>
+      <w:proofErr w:type="spellStart"/>
+      <w:r>
+        <w:rPr>
+          <w:rFonts w:ascii="Times New Roman" w:hAnsi="Times New Roman" w:cs="Times New Roman"/>
+          <w:lang w:val="en-US"/>
+        </w:rPr>
+        <w:t>has_prize</w:t>
+      </w:r>
+      <w:proofErr w:type="spellEnd"/>
     </w:p>
     <w:p>
       <w:pPr>
@@ -3625,8 +5093,17 @@
           <w:rFonts w:ascii="Times New Roman" w:hAnsi="Times New Roman" w:cs="Times New Roman"/>
           <w:lang w:val="en-US"/>
         </w:rPr>
-        <w:t xml:space="preserve">                students[surname] = has_prize</w:t>
-      </w:r>
+        <w:t xml:space="preserve">                students[surname] = </w:t>
+      </w:r>
+      <w:proofErr w:type="spellStart"/>
+      <w:r>
+        <w:rPr>
+          <w:rFonts w:ascii="Times New Roman" w:hAnsi="Times New Roman" w:cs="Times New Roman"/>
+          <w:lang w:val="en-US"/>
+        </w:rPr>
+        <w:t>has_prize</w:t>
+      </w:r>
+      <w:proofErr w:type="spellEnd"/>
     </w:p>
     <w:p>
       <w:pPr>
@@ -3669,7 +5146,39 @@
           <w:rFonts w:ascii="Times New Roman" w:hAnsi="Times New Roman" w:cs="Times New Roman"/>
           <w:lang w:val="en-US"/>
         </w:rPr>
-        <w:t>def evaluate_students(file1, file2):</w:t>
+        <w:t xml:space="preserve">def </w:t>
+      </w:r>
+      <w:proofErr w:type="spellStart"/>
+      <w:r>
+        <w:rPr>
+          <w:rFonts w:ascii="Times New Roman" w:hAnsi="Times New Roman" w:cs="Times New Roman"/>
+          <w:lang w:val="en-US"/>
+        </w:rPr>
+        <w:t>evaluate_</w:t>
+      </w:r>
+      <w:proofErr w:type="gramStart"/>
+      <w:r>
+        <w:rPr>
+          <w:rFonts w:ascii="Times New Roman" w:hAnsi="Times New Roman" w:cs="Times New Roman"/>
+          <w:lang w:val="en-US"/>
+        </w:rPr>
+        <w:t>students</w:t>
+      </w:r>
+      <w:proofErr w:type="spellEnd"/>
+      <w:r>
+        <w:rPr>
+          <w:rFonts w:ascii="Times New Roman" w:hAnsi="Times New Roman" w:cs="Times New Roman"/>
+          <w:lang w:val="en-US"/>
+        </w:rPr>
+        <w:t>(</w:t>
+      </w:r>
+      <w:proofErr w:type="gramEnd"/>
+      <w:r>
+        <w:rPr>
+          <w:rFonts w:ascii="Times New Roman" w:hAnsi="Times New Roman" w:cs="Times New Roman"/>
+          <w:lang w:val="en-US"/>
+        </w:rPr>
+        <w:t>file1, file2):</w:t>
       </w:r>
     </w:p>
     <w:p>
@@ -3714,24 +5223,56 @@
           <w:rFonts w:ascii="Times New Roman" w:hAnsi="Times New Roman" w:cs="Times New Roman"/>
           <w:lang w:val="en-US"/>
         </w:rPr>
-        <w:t>olymp1 = read_olympiad_file(file1)</w:t>
-      </w:r>
-    </w:p>
-    <w:p>
-      <w:pPr>
-        <w:spacing w:line="360" w:lineRule="auto"/>
-        <w:jc w:val="both"/>
-        <w:rPr>
-          <w:rFonts w:ascii="Times New Roman" w:hAnsi="Times New Roman" w:cs="Times New Roman"/>
-          <w:lang w:val="en-US"/>
-        </w:rPr>
-      </w:pPr>
-      <w:r>
-        <w:rPr>
-          <w:rFonts w:ascii="Times New Roman" w:hAnsi="Times New Roman" w:cs="Times New Roman"/>
-          <w:lang w:val="en-US"/>
-        </w:rPr>
-        <w:t xml:space="preserve">    olymp2 = read_olympiad_file(file2)</w:t>
+        <w:t xml:space="preserve">olymp1 = </w:t>
+      </w:r>
+      <w:proofErr w:type="spellStart"/>
+      <w:r>
+        <w:rPr>
+          <w:rFonts w:ascii="Times New Roman" w:hAnsi="Times New Roman" w:cs="Times New Roman"/>
+          <w:lang w:val="en-US"/>
+        </w:rPr>
+        <w:t>read_olympiad_file</w:t>
+      </w:r>
+      <w:proofErr w:type="spellEnd"/>
+      <w:r>
+        <w:rPr>
+          <w:rFonts w:ascii="Times New Roman" w:hAnsi="Times New Roman" w:cs="Times New Roman"/>
+          <w:lang w:val="en-US"/>
+        </w:rPr>
+        <w:t>(file1)</w:t>
+      </w:r>
+    </w:p>
+    <w:p>
+      <w:pPr>
+        <w:spacing w:line="360" w:lineRule="auto"/>
+        <w:jc w:val="both"/>
+        <w:rPr>
+          <w:rFonts w:ascii="Times New Roman" w:hAnsi="Times New Roman" w:cs="Times New Roman"/>
+          <w:lang w:val="en-US"/>
+        </w:rPr>
+      </w:pPr>
+      <w:r>
+        <w:rPr>
+          <w:rFonts w:ascii="Times New Roman" w:hAnsi="Times New Roman" w:cs="Times New Roman"/>
+          <w:lang w:val="en-US"/>
+        </w:rPr>
+        <w:t xml:space="preserve">    olymp2 = </w:t>
+      </w:r>
+      <w:proofErr w:type="spellStart"/>
+      <w:r>
+        <w:rPr>
+          <w:rFonts w:ascii="Times New Roman" w:hAnsi="Times New Roman" w:cs="Times New Roman"/>
+          <w:lang w:val="en-US"/>
+        </w:rPr>
+        <w:t>read_olympiad_file</w:t>
+      </w:r>
+      <w:proofErr w:type="spellEnd"/>
+      <w:r>
+        <w:rPr>
+          <w:rFonts w:ascii="Times New Roman" w:hAnsi="Times New Roman" w:cs="Times New Roman"/>
+          <w:lang w:val="en-US"/>
+        </w:rPr>
+        <w:t>(file2)</w:t>
       </w:r>
     </w:p>
     <w:p>
@@ -3765,25 +5306,73 @@
           <w:rFonts w:ascii="Times New Roman" w:hAnsi="Times New Roman" w:cs="Times New Roman"/>
           <w:lang w:val="en-US"/>
         </w:rPr>
-        <w:t xml:space="preserve">    all_students = set(olymp1.keys()) | set(olymp2.keys())</w:t>
-      </w:r>
-    </w:p>
-    <w:p>
-      <w:pPr>
-        <w:spacing w:line="360" w:lineRule="auto"/>
-        <w:jc w:val="both"/>
-        <w:rPr>
-          <w:rFonts w:ascii="Times New Roman" w:hAnsi="Times New Roman" w:cs="Times New Roman"/>
-          <w:lang w:val="en-US"/>
-        </w:rPr>
-      </w:pPr>
-      <w:r>
-        <w:rPr>
-          <w:rFonts w:ascii="Times New Roman" w:hAnsi="Times New Roman" w:cs="Times New Roman"/>
-          <w:lang w:val="en-US"/>
-        </w:rPr>
         <w:t xml:space="preserve">    </w:t>
       </w:r>
+      <w:proofErr w:type="spellStart"/>
+      <w:r>
+        <w:rPr>
+          <w:rFonts w:ascii="Times New Roman" w:hAnsi="Times New Roman" w:cs="Times New Roman"/>
+          <w:lang w:val="en-US"/>
+        </w:rPr>
+        <w:t>all_students</w:t>
+      </w:r>
+      <w:proofErr w:type="spellEnd"/>
+      <w:r>
+        <w:rPr>
+          <w:rFonts w:ascii="Times New Roman" w:hAnsi="Times New Roman" w:cs="Times New Roman"/>
+          <w:lang w:val="en-US"/>
+        </w:rPr>
+        <w:t xml:space="preserve"> = </w:t>
+      </w:r>
+      <w:proofErr w:type="gramStart"/>
+      <w:r>
+        <w:rPr>
+          <w:rFonts w:ascii="Times New Roman" w:hAnsi="Times New Roman" w:cs="Times New Roman"/>
+          <w:lang w:val="en-US"/>
+        </w:rPr>
+        <w:t>set(</w:t>
+      </w:r>
+      <w:proofErr w:type="gramEnd"/>
+      <w:r>
+        <w:rPr>
+          <w:rFonts w:ascii="Times New Roman" w:hAnsi="Times New Roman" w:cs="Times New Roman"/>
+          <w:lang w:val="en-US"/>
+        </w:rPr>
+        <w:t xml:space="preserve">olymp1.keys()) | </w:t>
+      </w:r>
+      <w:proofErr w:type="gramStart"/>
+      <w:r>
+        <w:rPr>
+          <w:rFonts w:ascii="Times New Roman" w:hAnsi="Times New Roman" w:cs="Times New Roman"/>
+          <w:lang w:val="en-US"/>
+        </w:rPr>
+        <w:t>set(</w:t>
+      </w:r>
+      <w:proofErr w:type="gramEnd"/>
+      <w:r>
+        <w:rPr>
+          <w:rFonts w:ascii="Times New Roman" w:hAnsi="Times New Roman" w:cs="Times New Roman"/>
+          <w:lang w:val="en-US"/>
+        </w:rPr>
+        <w:t>olymp2.keys())</w:t>
+      </w:r>
+    </w:p>
+    <w:p>
+      <w:pPr>
+        <w:spacing w:line="360" w:lineRule="auto"/>
+        <w:jc w:val="both"/>
+        <w:rPr>
+          <w:rFonts w:ascii="Times New Roman" w:hAnsi="Times New Roman" w:cs="Times New Roman"/>
+          <w:lang w:val="en-US"/>
+        </w:rPr>
+      </w:pPr>
+      <w:r>
+        <w:rPr>
+          <w:rFonts w:ascii="Times New Roman" w:hAnsi="Times New Roman" w:cs="Times New Roman"/>
+          <w:lang w:val="en-US"/>
+        </w:rPr>
+        <w:t xml:space="preserve">    </w:t>
+      </w:r>
     </w:p>
     <w:p>
       <w:pPr>
@@ -3816,7 +5405,23 @@
           <w:rFonts w:ascii="Times New Roman" w:hAnsi="Times New Roman" w:cs="Times New Roman"/>
           <w:lang w:val="en-US"/>
         </w:rPr>
-        <w:t xml:space="preserve">    for surname in sorted(all_students):</w:t>
+        <w:t xml:space="preserve">    for surname in sorted(</w:t>
+      </w:r>
+      <w:proofErr w:type="spellStart"/>
+      <w:r>
+        <w:rPr>
+          <w:rFonts w:ascii="Times New Roman" w:hAnsi="Times New Roman" w:cs="Times New Roman"/>
+          <w:lang w:val="en-US"/>
+        </w:rPr>
+        <w:t>all_students</w:t>
+      </w:r>
+      <w:proofErr w:type="spellEnd"/>
+      <w:r>
+        <w:rPr>
+          <w:rFonts w:ascii="Times New Roman" w:hAnsi="Times New Roman" w:cs="Times New Roman"/>
+          <w:lang w:val="en-US"/>
+        </w:rPr>
+        <w:t>):</w:t>
       </w:r>
     </w:p>
     <w:p>
@@ -3932,7 +5537,23 @@
           <w:rFonts w:ascii="Times New Roman" w:hAnsi="Times New Roman" w:cs="Times New Roman"/>
           <w:lang w:val="en-US"/>
         </w:rPr>
-        <w:t xml:space="preserve">        elif in_olymp2 and not in_olymp1:</w:t>
+        <w:t xml:space="preserve">        </w:t>
+      </w:r>
+      <w:proofErr w:type="spellStart"/>
+      <w:r>
+        <w:rPr>
+          <w:rFonts w:ascii="Times New Roman" w:hAnsi="Times New Roman" w:cs="Times New Roman"/>
+          <w:lang w:val="en-US"/>
+        </w:rPr>
+        <w:t>elif</w:t>
+      </w:r>
+      <w:proofErr w:type="spellEnd"/>
+      <w:r>
+        <w:rPr>
+          <w:rFonts w:ascii="Times New Roman" w:hAnsi="Times New Roman" w:cs="Times New Roman"/>
+          <w:lang w:val="en-US"/>
+        </w:rPr>
+        <w:t xml:space="preserve"> in_olymp2 and not in_olymp1:</w:t>
       </w:r>
     </w:p>
     <w:p>
@@ -3996,41 +5617,56 @@
           <w:rFonts w:ascii="Times New Roman" w:hAnsi="Times New Roman" w:cs="Times New Roman"/>
           <w:lang w:val="en-US"/>
         </w:rPr>
-        <w:t xml:space="preserve">            prize1 = olymp1.get(surname, False)</w:t>
-      </w:r>
-    </w:p>
-    <w:p>
-      <w:pPr>
-        <w:spacing w:line="360" w:lineRule="auto"/>
-        <w:jc w:val="both"/>
-        <w:rPr>
-          <w:rFonts w:ascii="Times New Roman" w:hAnsi="Times New Roman" w:cs="Times New Roman"/>
-          <w:lang w:val="en-US"/>
-        </w:rPr>
-      </w:pPr>
-      <w:r>
-        <w:rPr>
-          <w:rFonts w:ascii="Times New Roman" w:hAnsi="Times New Roman" w:cs="Times New Roman"/>
-          <w:lang w:val="en-US"/>
-        </w:rPr>
-        <w:t xml:space="preserve">            prize2 = olymp2.get(surname, False)</w:t>
-      </w:r>
-    </w:p>
-    <w:p>
-      <w:pPr>
-        <w:spacing w:line="360" w:lineRule="auto"/>
-        <w:jc w:val="both"/>
-        <w:rPr>
-          <w:rFonts w:ascii="Times New Roman" w:hAnsi="Times New Roman" w:cs="Times New Roman"/>
-          <w:lang w:val="en-US"/>
-        </w:rPr>
-      </w:pPr>
-      <w:r>
-        <w:rPr>
-          <w:rFonts w:ascii="Times New Roman" w:hAnsi="Times New Roman" w:cs="Times New Roman"/>
-          <w:lang w:val="en-US"/>
-        </w:rPr>
-        <w:t xml:space="preserve">            prize_count = int(prize1) + int(prize2)</w:t>
+        <w:t xml:space="preserve">            prize1 = </w:t>
+      </w:r>
+      <w:proofErr w:type="gramStart"/>
+      <w:r>
+        <w:rPr>
+          <w:rFonts w:ascii="Times New Roman" w:hAnsi="Times New Roman" w:cs="Times New Roman"/>
+          <w:lang w:val="en-US"/>
+        </w:rPr>
+        <w:t>olymp1.get(</w:t>
+      </w:r>
+      <w:proofErr w:type="gramEnd"/>
+      <w:r>
+        <w:rPr>
+          <w:rFonts w:ascii="Times New Roman" w:hAnsi="Times New Roman" w:cs="Times New Roman"/>
+          <w:lang w:val="en-US"/>
+        </w:rPr>
+        <w:t>surname, False)</w:t>
+      </w:r>
+    </w:p>
+    <w:p>
+      <w:pPr>
+        <w:spacing w:line="360" w:lineRule="auto"/>
+        <w:jc w:val="both"/>
+        <w:rPr>
+          <w:rFonts w:ascii="Times New Roman" w:hAnsi="Times New Roman" w:cs="Times New Roman"/>
+          <w:lang w:val="en-US"/>
+        </w:rPr>
+      </w:pPr>
+      <w:r>
+        <w:rPr>
+          <w:rFonts w:ascii="Times New Roman" w:hAnsi="Times New Roman" w:cs="Times New Roman"/>
+          <w:lang w:val="en-US"/>
+        </w:rPr>
+        <w:t xml:space="preserve">            prize2 = </w:t>
+      </w:r>
+      <w:proofErr w:type="gramStart"/>
+      <w:r>
+        <w:rPr>
+          <w:rFonts w:ascii="Times New Roman" w:hAnsi="Times New Roman" w:cs="Times New Roman"/>
+          <w:lang w:val="en-US"/>
+        </w:rPr>
+        <w:t>olymp2.get(</w:t>
+      </w:r>
+      <w:proofErr w:type="gramEnd"/>
+      <w:r>
+        <w:rPr>
+          <w:rFonts w:ascii="Times New Roman" w:hAnsi="Times New Roman" w:cs="Times New Roman"/>
+          <w:lang w:val="en-US"/>
+        </w:rPr>
+        <w:t>surname, False)</w:t>
       </w:r>
     </w:p>
     <w:p>
@@ -4049,22 +5685,71 @@
         </w:rPr>
         <w:t xml:space="preserve">            </w:t>
       </w:r>
-    </w:p>
-    <w:p>
-      <w:pPr>
-        <w:spacing w:line="360" w:lineRule="auto"/>
-        <w:jc w:val="both"/>
-        <w:rPr>
-          <w:rFonts w:ascii="Times New Roman" w:hAnsi="Times New Roman" w:cs="Times New Roman"/>
-          <w:lang w:val="en-US"/>
-        </w:rPr>
-      </w:pPr>
-      <w:r>
-        <w:rPr>
-          <w:rFonts w:ascii="Times New Roman" w:hAnsi="Times New Roman" w:cs="Times New Roman"/>
-          <w:lang w:val="en-US"/>
-        </w:rPr>
-        <w:t xml:space="preserve">            if prize_count == 0:</w:t>
+      <w:proofErr w:type="spellStart"/>
+      <w:r>
+        <w:rPr>
+          <w:rFonts w:ascii="Times New Roman" w:hAnsi="Times New Roman" w:cs="Times New Roman"/>
+          <w:lang w:val="en-US"/>
+        </w:rPr>
+        <w:t>prize_count</w:t>
+      </w:r>
+      <w:proofErr w:type="spellEnd"/>
+      <w:r>
+        <w:rPr>
+          <w:rFonts w:ascii="Times New Roman" w:hAnsi="Times New Roman" w:cs="Times New Roman"/>
+          <w:lang w:val="en-US"/>
+        </w:rPr>
+        <w:t xml:space="preserve"> = int(prize1) + int(prize2)</w:t>
+      </w:r>
+    </w:p>
+    <w:p>
+      <w:pPr>
+        <w:spacing w:line="360" w:lineRule="auto"/>
+        <w:jc w:val="both"/>
+        <w:rPr>
+          <w:rFonts w:ascii="Times New Roman" w:hAnsi="Times New Roman" w:cs="Times New Roman"/>
+          <w:lang w:val="en-US"/>
+        </w:rPr>
+      </w:pPr>
+      <w:r>
+        <w:rPr>
+          <w:rFonts w:ascii="Times New Roman" w:hAnsi="Times New Roman" w:cs="Times New Roman"/>
+          <w:lang w:val="en-US"/>
+        </w:rPr>
+        <w:t xml:space="preserve">            </w:t>
+      </w:r>
+    </w:p>
+    <w:p>
+      <w:pPr>
+        <w:spacing w:line="360" w:lineRule="auto"/>
+        <w:jc w:val="both"/>
+        <w:rPr>
+          <w:rFonts w:ascii="Times New Roman" w:hAnsi="Times New Roman" w:cs="Times New Roman"/>
+          <w:lang w:val="en-US"/>
+        </w:rPr>
+      </w:pPr>
+      <w:r>
+        <w:rPr>
+          <w:rFonts w:ascii="Times New Roman" w:hAnsi="Times New Roman" w:cs="Times New Roman"/>
+          <w:lang w:val="en-US"/>
+        </w:rPr>
+        <w:t xml:space="preserve">            if </w:t>
+      </w:r>
+      <w:proofErr w:type="spellStart"/>
+      <w:r>
+        <w:rPr>
+          <w:rFonts w:ascii="Times New Roman" w:hAnsi="Times New Roman" w:cs="Times New Roman"/>
+          <w:lang w:val="en-US"/>
+        </w:rPr>
+        <w:t>prize_count</w:t>
+      </w:r>
+      <w:proofErr w:type="spellEnd"/>
+      <w:r>
+        <w:rPr>
+          <w:rFonts w:ascii="Times New Roman" w:hAnsi="Times New Roman" w:cs="Times New Roman"/>
+          <w:lang w:val="en-US"/>
+        </w:rPr>
+        <w:t xml:space="preserve"> == 0:</w:t>
       </w:r>
     </w:p>
     <w:p>
@@ -4098,7 +5783,39 @@
           <w:rFonts w:ascii="Times New Roman" w:hAnsi="Times New Roman" w:cs="Times New Roman"/>
           <w:lang w:val="en-US"/>
         </w:rPr>
-        <w:t xml:space="preserve">            elif prize_count == 1:</w:t>
+        <w:t xml:space="preserve">            </w:t>
+      </w:r>
+      <w:proofErr w:type="spellStart"/>
+      <w:r>
+        <w:rPr>
+          <w:rFonts w:ascii="Times New Roman" w:hAnsi="Times New Roman" w:cs="Times New Roman"/>
+          <w:lang w:val="en-US"/>
+        </w:rPr>
+        <w:t>elif</w:t>
+      </w:r>
+      <w:proofErr w:type="spellEnd"/>
+      <w:r>
+        <w:rPr>
+          <w:rFonts w:ascii="Times New Roman" w:hAnsi="Times New Roman" w:cs="Times New Roman"/>
+          <w:lang w:val="en-US"/>
+        </w:rPr>
+        <w:t xml:space="preserve"> </w:t>
+      </w:r>
+      <w:proofErr w:type="spellStart"/>
+      <w:r>
+        <w:rPr>
+          <w:rFonts w:ascii="Times New Roman" w:hAnsi="Times New Roman" w:cs="Times New Roman"/>
+          <w:lang w:val="en-US"/>
+        </w:rPr>
+        <w:t>prize_count</w:t>
+      </w:r>
+      <w:proofErr w:type="spellEnd"/>
+      <w:r>
+        <w:rPr>
+          <w:rFonts w:ascii="Times New Roman" w:hAnsi="Times New Roman" w:cs="Times New Roman"/>
+          <w:lang w:val="en-US"/>
+        </w:rPr>
+        <w:t xml:space="preserve"> == 1:</w:t>
       </w:r>
     </w:p>
     <w:p>
@@ -4183,7 +5900,25 @@
           <w:rFonts w:ascii="Times New Roman" w:hAnsi="Times New Roman" w:cs="Times New Roman"/>
           <w:lang w:val="en-US"/>
         </w:rPr>
-        <w:t xml:space="preserve">        results.append((surname, result))</w:t>
+        <w:t xml:space="preserve">        </w:t>
+      </w:r>
+      <w:proofErr w:type="spellStart"/>
+      <w:proofErr w:type="gramStart"/>
+      <w:r>
+        <w:rPr>
+          <w:rFonts w:ascii="Times New Roman" w:hAnsi="Times New Roman" w:cs="Times New Roman"/>
+          <w:lang w:val="en-US"/>
+        </w:rPr>
+        <w:t>results.append</w:t>
+      </w:r>
+      <w:proofErr w:type="spellEnd"/>
+      <w:proofErr w:type="gramEnd"/>
+      <w:r>
+        <w:rPr>
+          <w:rFonts w:ascii="Times New Roman" w:hAnsi="Times New Roman" w:cs="Times New Roman"/>
+          <w:lang w:val="en-US"/>
+        </w:rPr>
+        <w:t>((surname, result))</w:t>
       </w:r>
     </w:p>
     <w:p>
@@ -4218,12 +5953,28 @@
         </w:rPr>
         <w:t xml:space="preserve">    </w:t>
       </w:r>
-      <w:r>
-        <w:rPr>
-          <w:rFonts w:ascii="Times New Roman" w:hAnsi="Times New Roman" w:cs="Times New Roman"/>
-        </w:rPr>
-        <w:t>return results</w:t>
-      </w:r>
+      <w:proofErr w:type="spellStart"/>
+      <w:r>
+        <w:rPr>
+          <w:rFonts w:ascii="Times New Roman" w:hAnsi="Times New Roman" w:cs="Times New Roman"/>
+        </w:rPr>
+        <w:t>return</w:t>
+      </w:r>
+      <w:proofErr w:type="spellEnd"/>
+      <w:r>
+        <w:rPr>
+          <w:rFonts w:ascii="Times New Roman" w:hAnsi="Times New Roman" w:cs="Times New Roman"/>
+        </w:rPr>
+        <w:t xml:space="preserve"> </w:t>
+      </w:r>
+      <w:proofErr w:type="spellStart"/>
+      <w:r>
+        <w:rPr>
+          <w:rFonts w:ascii="Times New Roman" w:hAnsi="Times New Roman" w:cs="Times New Roman"/>
+        </w:rPr>
+        <w:t>results</w:t>
+      </w:r>
+      <w:proofErr w:type="spellEnd"/>
     </w:p>
     <w:p>
       <w:pPr>
@@ -4442,7 +6193,35 @@
           <w:sz w:val="27"/>
           <w:szCs w:val="27"/>
         </w:rPr>
-        <w:t>• Использование set() для объединения — классический паттерн в Python</w:t>
+        <w:t xml:space="preserve">• Использование </w:t>
+      </w:r>
+      <w:proofErr w:type="spellStart"/>
+      <w:proofErr w:type="gramStart"/>
+      <w:r>
+        <w:rPr>
+          <w:rFonts w:ascii="Times New Roman" w:hAnsi="Times New Roman" w:cs="Times New Roman"/>
+          <w:sz w:val="27"/>
+          <w:szCs w:val="27"/>
+        </w:rPr>
+        <w:t>set</w:t>
+      </w:r>
+      <w:proofErr w:type="spellEnd"/>
+      <w:r>
+        <w:rPr>
+          <w:rFonts w:ascii="Times New Roman" w:hAnsi="Times New Roman" w:cs="Times New Roman"/>
+          <w:sz w:val="27"/>
+          <w:szCs w:val="27"/>
+        </w:rPr>
+        <w:t>(</w:t>
+      </w:r>
+      <w:proofErr w:type="gramEnd"/>
+      <w:r>
+        <w:rPr>
+          <w:rFonts w:ascii="Times New Roman" w:hAnsi="Times New Roman" w:cs="Times New Roman"/>
+          <w:sz w:val="27"/>
+          <w:szCs w:val="27"/>
+        </w:rPr>
+        <w:t>) для объединения — классический паттерн в Python</w:t>
       </w:r>
     </w:p>
     <w:p>
@@ -5099,7 +6878,45 @@
           <w:sz w:val="27"/>
           <w:szCs w:val="27"/>
         </w:rPr>
-        <w:t>Я выбрал Go, так как это мой основной рабочий инструмент и работаю я преимущественно на нем,так что практика с ним мне наиболее полезна. Он дает строгую типизацию, высокую скорость выполнения и компилируется в один бинарник.</w:t>
+        <w:t xml:space="preserve">Я выбрал Go, так как это мой основной рабочий инструмент и работаю я преимущественно на </w:t>
+      </w:r>
+      <w:proofErr w:type="spellStart"/>
+      <w:proofErr w:type="gramStart"/>
+      <w:r>
+        <w:rPr>
+          <w:rFonts w:ascii="Times New Roman" w:hAnsi="Times New Roman" w:cs="Times New Roman"/>
+          <w:sz w:val="27"/>
+          <w:szCs w:val="27"/>
+        </w:rPr>
+        <w:t>нем,так</w:t>
+      </w:r>
+      <w:proofErr w:type="spellEnd"/>
+      <w:proofErr w:type="gramEnd"/>
+      <w:r>
+        <w:rPr>
+          <w:rFonts w:ascii="Times New Roman" w:hAnsi="Times New Roman" w:cs="Times New Roman"/>
+          <w:sz w:val="27"/>
+          <w:szCs w:val="27"/>
+        </w:rPr>
+        <w:t xml:space="preserve"> что практика с ним мне наиболее полезна. Он дает строгую типизацию, высокую скорость выполнения и компилируется в один </w:t>
+      </w:r>
+      <w:proofErr w:type="spellStart"/>
+      <w:r>
+        <w:rPr>
+          <w:rFonts w:ascii="Times New Roman" w:hAnsi="Times New Roman" w:cs="Times New Roman"/>
+          <w:sz w:val="27"/>
+          <w:szCs w:val="27"/>
+        </w:rPr>
+        <w:t>бинарник</w:t>
+      </w:r>
+      <w:proofErr w:type="spellEnd"/>
+      <w:r>
+        <w:rPr>
+          <w:rFonts w:ascii="Times New Roman" w:hAnsi="Times New Roman" w:cs="Times New Roman"/>
+          <w:sz w:val="27"/>
+          <w:szCs w:val="27"/>
+        </w:rPr>
+        <w:t>.</w:t>
       </w:r>
       <w:r>
         <w:rPr>
@@ -5529,7 +7346,43 @@
           <w:sz w:val="27"/>
           <w:szCs w:val="27"/>
         </w:rPr>
-        <w:t>вносить практики продового кода в свой проект даже не стремясь к этому, просто</w:t>
+        <w:t xml:space="preserve">вносить практики </w:t>
+      </w:r>
+      <w:proofErr w:type="spellStart"/>
+      <w:r>
+        <w:rPr>
+          <w:rFonts w:ascii="Times New Roman" w:hAnsi="Times New Roman" w:cs="Times New Roman"/>
+          <w:sz w:val="27"/>
+          <w:szCs w:val="27"/>
+        </w:rPr>
+        <w:t>продового</w:t>
+      </w:r>
+      <w:proofErr w:type="spellEnd"/>
+      <w:r>
+        <w:rPr>
+          <w:rFonts w:ascii="Times New Roman" w:hAnsi="Times New Roman" w:cs="Times New Roman"/>
+          <w:sz w:val="27"/>
+          <w:szCs w:val="27"/>
+        </w:rPr>
+        <w:t xml:space="preserve"> кода в свой </w:t>
+      </w:r>
+      <w:proofErr w:type="gramStart"/>
+      <w:r>
+        <w:rPr>
+          <w:rFonts w:ascii="Times New Roman" w:hAnsi="Times New Roman" w:cs="Times New Roman"/>
+          <w:sz w:val="27"/>
+          <w:szCs w:val="27"/>
+        </w:rPr>
+        <w:t>проект</w:t>
+      </w:r>
+      <w:proofErr w:type="gramEnd"/>
+      <w:r>
+        <w:rPr>
+          <w:rFonts w:ascii="Times New Roman" w:hAnsi="Times New Roman" w:cs="Times New Roman"/>
+          <w:sz w:val="27"/>
+          <w:szCs w:val="27"/>
+        </w:rPr>
+        <w:t xml:space="preserve"> даже не стремясь к этому, просто</w:t>
       </w:r>
     </w:p>
     <w:p>
@@ -5564,7 +7417,25 @@
           <w:sz w:val="27"/>
           <w:szCs w:val="27"/>
         </w:rPr>
-        <w:t>в рамках этой (не продовой) задачи.</w:t>
+        <w:t xml:space="preserve">в рамках этой (не </w:t>
+      </w:r>
+      <w:proofErr w:type="spellStart"/>
+      <w:r>
+        <w:rPr>
+          <w:rFonts w:ascii="Times New Roman" w:hAnsi="Times New Roman" w:cs="Times New Roman"/>
+          <w:sz w:val="27"/>
+          <w:szCs w:val="27"/>
+        </w:rPr>
+        <w:t>продовой</w:t>
+      </w:r>
+      <w:proofErr w:type="spellEnd"/>
+      <w:r>
+        <w:rPr>
+          <w:rFonts w:ascii="Times New Roman" w:hAnsi="Times New Roman" w:cs="Times New Roman"/>
+          <w:sz w:val="27"/>
+          <w:szCs w:val="27"/>
+        </w:rPr>
+        <w:t>) задачи.</w:t>
       </w:r>
     </w:p>
     <w:p>
@@ -6142,15 +8013,35 @@
           <w:sz w:val="27"/>
           <w:szCs w:val="27"/>
         </w:rPr>
-        <w:t>Корректность кода зависит от понимания всех граничных случаев (например,</w:t>
-      </w:r>
-      <w:r>
-        <w:rPr>
-          <w:rFonts w:ascii="Times New Roman" w:hAnsi="Times New Roman" w:cs="Times New Roman"/>
-          <w:sz w:val="27"/>
-          <w:szCs w:val="27"/>
-        </w:rPr>
-        <w:t>повторяющиеся фамилии), а не от выбора языка или подхода</w:t>
+        <w:t>Корректность кода зависит от понимания всех граничных случаев (</w:t>
+      </w:r>
+      <w:proofErr w:type="spellStart"/>
+      <w:proofErr w:type="gramStart"/>
+      <w:r>
+        <w:rPr>
+          <w:rFonts w:ascii="Times New Roman" w:hAnsi="Times New Roman" w:cs="Times New Roman"/>
+          <w:sz w:val="27"/>
+          <w:szCs w:val="27"/>
+        </w:rPr>
+        <w:t>например,</w:t>
+      </w:r>
+      <w:r>
+        <w:rPr>
+          <w:rFonts w:ascii="Times New Roman" w:hAnsi="Times New Roman" w:cs="Times New Roman"/>
+          <w:sz w:val="27"/>
+          <w:szCs w:val="27"/>
+        </w:rPr>
+        <w:t>повторяющиеся</w:t>
+      </w:r>
+      <w:proofErr w:type="spellEnd"/>
+      <w:proofErr w:type="gramEnd"/>
+      <w:r>
+        <w:rPr>
+          <w:rFonts w:ascii="Times New Roman" w:hAnsi="Times New Roman" w:cs="Times New Roman"/>
+          <w:sz w:val="27"/>
+          <w:szCs w:val="27"/>
+        </w:rPr>
+        <w:t xml:space="preserve"> фамилии), а не от выбора языка или подхода</w:t>
       </w:r>
     </w:p>
     <w:p>
@@ -6273,7 +8164,16 @@
           <w:sz w:val="27"/>
           <w:szCs w:val="27"/>
         </w:rPr>
-        <w:t>Для задач с большими объёмами данных или высокочастотным выполнением</w:t>
+        <w:t xml:space="preserve">Для задач с большими объёмами данных или высокочастотным </w:t>
+      </w:r>
+      <w:proofErr w:type="gramStart"/>
+      <w:r>
+        <w:rPr>
+          <w:rFonts w:ascii="Times New Roman" w:hAnsi="Times New Roman" w:cs="Times New Roman"/>
+          <w:sz w:val="27"/>
+          <w:szCs w:val="27"/>
+        </w:rPr>
+        <w:t>выполнением</w:t>
       </w:r>
       <w:r>
         <w:rPr>
@@ -6289,7 +8189,16 @@
           <w:sz w:val="27"/>
           <w:szCs w:val="27"/>
         </w:rPr>
-        <w:t xml:space="preserve"> разница в производительности становится критической</w:t>
+        <w:t xml:space="preserve"> разница</w:t>
+      </w:r>
+      <w:proofErr w:type="gramEnd"/>
+      <w:r>
+        <w:rPr>
+          <w:rFonts w:ascii="Times New Roman" w:hAnsi="Times New Roman" w:cs="Times New Roman"/>
+          <w:sz w:val="27"/>
+          <w:szCs w:val="27"/>
+        </w:rPr>
+        <w:t xml:space="preserve"> в производительности становится критической</w:t>
       </w:r>
     </w:p>
     <w:p>
@@ -6515,7 +8424,25 @@
           <w:sz w:val="27"/>
           <w:szCs w:val="27"/>
         </w:rPr>
-        <w:t>Разработчик по привычке вносит практики продового кода, что улучшает</w:t>
+        <w:t xml:space="preserve">Разработчик по привычке вносит практики </w:t>
+      </w:r>
+      <w:proofErr w:type="spellStart"/>
+      <w:r>
+        <w:rPr>
+          <w:rFonts w:ascii="Times New Roman" w:hAnsi="Times New Roman" w:cs="Times New Roman"/>
+          <w:sz w:val="27"/>
+          <w:szCs w:val="27"/>
+        </w:rPr>
+        <w:t>продового</w:t>
+      </w:r>
+      <w:proofErr w:type="spellEnd"/>
+      <w:r>
+        <w:rPr>
+          <w:rFonts w:ascii="Times New Roman" w:hAnsi="Times New Roman" w:cs="Times New Roman"/>
+          <w:sz w:val="27"/>
+          <w:szCs w:val="27"/>
+        </w:rPr>
+        <w:t xml:space="preserve"> кода, что улучшает</w:t>
       </w:r>
       <w:r>
         <w:rPr>
@@ -6654,7 +8581,25 @@
           <w:sz w:val="27"/>
           <w:szCs w:val="27"/>
         </w:rPr>
-        <w:t>Декларативный стиль (Python): читается как описание результата, требуетпонимания идиом языка</w:t>
+        <w:t xml:space="preserve">Декларативный стиль (Python): читается как описание результата, </w:t>
+      </w:r>
+      <w:proofErr w:type="spellStart"/>
+      <w:r>
+        <w:rPr>
+          <w:rFonts w:ascii="Times New Roman" w:hAnsi="Times New Roman" w:cs="Times New Roman"/>
+          <w:sz w:val="27"/>
+          <w:szCs w:val="27"/>
+        </w:rPr>
+        <w:t>требуетпонимания</w:t>
+      </w:r>
+      <w:proofErr w:type="spellEnd"/>
+      <w:r>
+        <w:rPr>
+          <w:rFonts w:ascii="Times New Roman" w:hAnsi="Times New Roman" w:cs="Times New Roman"/>
+          <w:sz w:val="27"/>
+          <w:szCs w:val="27"/>
+        </w:rPr>
+        <w:t xml:space="preserve"> идиом языка</w:t>
       </w:r>
     </w:p>
     <w:p>
@@ -7137,7 +9082,25 @@
           <w:sz w:val="27"/>
           <w:szCs w:val="27"/>
         </w:rPr>
-        <w:t>Комбинировать: Python для оркестрации, Go для вычислений</w:t>
+        <w:t xml:space="preserve">Комбинировать: Python для </w:t>
+      </w:r>
+      <w:proofErr w:type="spellStart"/>
+      <w:r>
+        <w:rPr>
+          <w:rFonts w:ascii="Times New Roman" w:hAnsi="Times New Roman" w:cs="Times New Roman"/>
+          <w:sz w:val="27"/>
+          <w:szCs w:val="27"/>
+        </w:rPr>
+        <w:t>оркестрации</w:t>
+      </w:r>
+      <w:proofErr w:type="spellEnd"/>
+      <w:r>
+        <w:rPr>
+          <w:rFonts w:ascii="Times New Roman" w:hAnsi="Times New Roman" w:cs="Times New Roman"/>
+          <w:sz w:val="27"/>
+          <w:szCs w:val="27"/>
+        </w:rPr>
+        <w:t>, Go для вычислений</w:t>
       </w:r>
     </w:p>
     <w:p>
@@ -9702,7 +11665,6 @@
   <w:style w:type="character" w:default="1" w:styleId="a0">
     <w:name w:val="Default Paragraph Font"/>
     <w:uiPriority w:val="1"/>
-    <w:semiHidden/>
     <w:unhideWhenUsed/>
   </w:style>
   <w:style w:type="table" w:default="1" w:styleId="a1">

</xml_diff>